<commit_message>
Update Requirements Analysis Folder
</commit_message>
<xml_diff>
--- a/Documentation/Analysis/Requirements Analysis/BusinessRequirements - W.docx
+++ b/Documentation/Analysis/Requirements Analysis/BusinessRequirements - W.docx
@@ -397,7 +397,7 @@
           <w:szCs w:val="28"/>
           <w:rtl/>
         </w:rPr>
-        <w:t>بر چت‌های کارمندان پشتیبانی با مشتریان نظارت کامل داشته باشد</w:t>
+        <w:t>آمار دقیق مشتریان ماهانه، میزان رزروها را مشاهده کند</w:t>
       </w:r>
       <w:r>
         <w:rPr>
@@ -437,7 +437,7 @@
           <w:szCs w:val="28"/>
           <w:rtl/>
         </w:rPr>
-        <w:t>آمار دقیق مشتریان ماهانه، میزان رزروها و نمودارهای روند رشد کسب‌وکار را مشاهده کند</w:t>
+        <w:t>بر تبلیغات و اطلاعیه‌هایی که بخش پشتیبانی در صفحه کسب‌وکار قرار می‌دهد نظارت کند</w:t>
       </w:r>
       <w:r>
         <w:rPr>
@@ -477,7 +477,29 @@
           <w:szCs w:val="28"/>
           <w:rtl/>
         </w:rPr>
-        <w:t>بر تبلیغات و اطلاعیه‌هایی که بخش پشتیبانی در صفحه کسب‌وکار قرار می‌دهد نظارت کند</w:t>
+        <w:t>در داشبورد خود، علاوه بر نوبت‌ها، بتواند وظایف</w:t>
+      </w:r>
+      <w:r>
+        <w:rPr>
+          <w:rFonts w:cs="Mj_Casablanca Light"/>
+          <w:b/>
+          <w:bCs/>
+          <w:sz w:val="28"/>
+          <w:szCs w:val="28"/>
+          <w:lang w:bidi="fa-IR"/>
+        </w:rPr>
+        <w:t xml:space="preserve"> (Tasks) </w:t>
+      </w:r>
+      <w:r>
+        <w:rPr>
+          <w:rFonts w:cs="Mj_Casablanca Light"/>
+          <w:b/>
+          <w:bCs/>
+          <w:sz w:val="28"/>
+          <w:szCs w:val="28"/>
+          <w:rtl/>
+        </w:rPr>
+        <w:t>و محتواهای تولید شده توسط کارمندانش را مدیریت کند</w:t>
       </w:r>
       <w:r>
         <w:rPr>
@@ -517,7 +539,29 @@
           <w:szCs w:val="28"/>
           <w:rtl/>
         </w:rPr>
-        <w:t>در فرآیندهای اتوماسیون اداری سیستم مشارکت کرده و وظایف مربوط به خود را پیگیری کند</w:t>
+        <w:t>نوبت‌ها را در قالب یک نوار زمان</w:t>
+      </w:r>
+      <w:r>
+        <w:rPr>
+          <w:rFonts w:cs="Mj_Casablanca Light"/>
+          <w:b/>
+          <w:bCs/>
+          <w:sz w:val="28"/>
+          <w:szCs w:val="28"/>
+          <w:lang w:bidi="fa-IR"/>
+        </w:rPr>
+        <w:t xml:space="preserve"> (Timeline) </w:t>
+      </w:r>
+      <w:r>
+        <w:rPr>
+          <w:rFonts w:cs="Mj_Casablanca Light"/>
+          <w:b/>
+          <w:bCs/>
+          <w:sz w:val="28"/>
+          <w:szCs w:val="28"/>
+          <w:rtl/>
+        </w:rPr>
+        <w:t>مشاهده کند</w:t>
       </w:r>
       <w:r>
         <w:rPr>
@@ -529,6 +573,666 @@
           <w:lang w:bidi="fa-IR"/>
         </w:rPr>
         <w:t>.</w:t>
+      </w:r>
+    </w:p>
+    <w:p>
+      <w:pPr>
+        <w:rPr>
+          <w:rFonts w:cs="Mj_Casablanca Light"/>
+          <w:b/>
+          <w:bCs/>
+          <w:sz w:val="28"/>
+          <w:szCs w:val="28"/>
+          <w:rtl/>
+          <w:lang w:bidi="fa-IR"/>
+        </w:rPr>
+      </w:pPr>
+      <w:r>
+        <w:rPr>
+          <w:rFonts w:cs="Mj_Casablanca Light"/>
+          <w:b/>
+          <w:bCs/>
+          <w:sz w:val="28"/>
+          <w:szCs w:val="28"/>
+          <w:rtl/>
+          <w:lang w:bidi="fa-IR"/>
+        </w:rPr>
+        <w:br w:type="page"/>
+      </w:r>
+    </w:p>
+    <w:p>
+      <w:pPr>
+        <w:bidi/>
+        <w:rPr>
+          <w:rFonts w:cs="Mj_Casablanca Light"/>
+          <w:color w:val="00B0F0"/>
+          <w:sz w:val="36"/>
+          <w:szCs w:val="36"/>
+          <w:rtl/>
+          <w:lang w:bidi="fa-IR"/>
+        </w:rPr>
+      </w:pPr>
+      <w:r>
+        <w:rPr>
+          <w:rFonts w:cs="Mj_Casablanca Light" w:hint="cs"/>
+          <w:color w:val="00B0F0"/>
+          <w:sz w:val="36"/>
+          <w:szCs w:val="36"/>
+          <w:rtl/>
+          <w:lang w:bidi="fa-IR"/>
+        </w:rPr>
+        <w:lastRenderedPageBreak/>
+        <w:t>2</w:t>
+      </w:r>
+      <w:r>
+        <w:rPr>
+          <w:rFonts w:cs="Mj_Casablanca Light"/>
+          <w:color w:val="00B0F0"/>
+          <w:sz w:val="36"/>
+          <w:szCs w:val="36"/>
+          <w:lang w:bidi="fa-IR"/>
+        </w:rPr>
+        <w:t xml:space="preserve">. </w:t>
+      </w:r>
+      <w:r>
+        <w:rPr>
+          <w:rFonts w:cs="Mj_Casablanca Light"/>
+          <w:color w:val="00B0F0"/>
+          <w:sz w:val="36"/>
+          <w:szCs w:val="36"/>
+          <w:rtl/>
+        </w:rPr>
+        <w:t>نیازمندی‌های مشتری</w:t>
+      </w:r>
+    </w:p>
+    <w:p>
+      <w:pPr>
+        <w:bidi/>
+        <w:rPr>
+          <w:rFonts w:ascii="Arial" w:hAnsi="Arial" w:cs="Arial"/>
+          <w:sz w:val="32"/>
+          <w:szCs w:val="32"/>
+          <w:rtl/>
+          <w:lang w:bidi="fa-IR"/>
+        </w:rPr>
+      </w:pPr>
+      <w:r>
+        <w:rPr>
+          <w:rFonts w:cs="Mj_Casablanca Light" w:hint="cs"/>
+          <w:sz w:val="32"/>
+          <w:szCs w:val="32"/>
+          <w:rtl/>
+          <w:lang w:bidi="fa-IR"/>
+        </w:rPr>
+        <w:t xml:space="preserve">مشتري نياز دارد كه </w:t>
+      </w:r>
+      <w:r>
+        <w:rPr>
+          <w:rFonts w:cs="Mj_Casablanca Light" w:hint="cs"/>
+          <w:sz w:val="32"/>
+          <w:szCs w:val="32"/>
+          <w:rtl/>
+          <w:lang w:bidi="fa-IR"/>
+        </w:rPr>
+        <w:t xml:space="preserve">بتواند </w:t>
+      </w:r>
+      <w:r>
+        <w:rPr>
+          <w:rFonts w:ascii="Arial" w:hAnsi="Arial" w:cs="Arial" w:hint="cs"/>
+          <w:sz w:val="32"/>
+          <w:szCs w:val="32"/>
+          <w:rtl/>
+          <w:lang w:bidi="fa-IR"/>
+        </w:rPr>
+        <w:t>…</w:t>
+      </w:r>
+    </w:p>
+    <w:p>
+      <w:pPr>
+        <w:pStyle w:val="ListParagraph"/>
+        <w:numPr>
+          <w:ilvl w:val="0"/>
+          <w:numId w:val="6"/>
+        </w:numPr>
+        <w:bidi/>
+        <w:rPr>
+          <w:rFonts w:cs="Mj_Casablanca Light"/>
+          <w:sz w:val="28"/>
+          <w:szCs w:val="28"/>
+          <w:lang w:bidi="fa-IR"/>
+        </w:rPr>
+      </w:pPr>
+      <w:r>
+        <w:rPr>
+          <w:rFonts w:cs="Mj_Casablanca Light"/>
+          <w:sz w:val="28"/>
+          <w:szCs w:val="28"/>
+          <w:rtl/>
+        </w:rPr>
+        <w:t>در سایت ثبت‌نام کرده و وارد حساب کاربری خود شود</w:t>
+      </w:r>
+      <w:r>
+        <w:rPr>
+          <w:rFonts w:cs="Mj_Casablanca Light"/>
+          <w:sz w:val="28"/>
+          <w:szCs w:val="28"/>
+          <w:lang w:bidi="fa-IR"/>
+        </w:rPr>
+        <w:t xml:space="preserve"> (Login/Register). </w:t>
+      </w:r>
+    </w:p>
+    <w:p>
+      <w:pPr>
+        <w:pStyle w:val="ListParagraph"/>
+        <w:numPr>
+          <w:ilvl w:val="0"/>
+          <w:numId w:val="6"/>
+        </w:numPr>
+        <w:bidi/>
+        <w:rPr>
+          <w:rFonts w:cs="Mj_Casablanca Light"/>
+          <w:sz w:val="28"/>
+          <w:szCs w:val="28"/>
+          <w:lang w:bidi="fa-IR"/>
+        </w:rPr>
+      </w:pPr>
+      <w:r>
+        <w:rPr>
+          <w:rFonts w:cs="Mj_Casablanca Light"/>
+          <w:sz w:val="28"/>
+          <w:szCs w:val="28"/>
+          <w:rtl/>
+        </w:rPr>
+        <w:t>کسب‌وکارها را بر اساس دسته‌بندی، خدمات و موقعیت فیلتر کند</w:t>
+      </w:r>
+      <w:r>
+        <w:rPr>
+          <w:rFonts w:cs="Mj_Casablanca Light"/>
+          <w:sz w:val="28"/>
+          <w:szCs w:val="28"/>
+          <w:lang w:bidi="fa-IR"/>
+        </w:rPr>
+        <w:t xml:space="preserve">. </w:t>
+      </w:r>
+    </w:p>
+    <w:p>
+      <w:pPr>
+        <w:pStyle w:val="ListParagraph"/>
+        <w:numPr>
+          <w:ilvl w:val="0"/>
+          <w:numId w:val="6"/>
+        </w:numPr>
+        <w:bidi/>
+        <w:rPr>
+          <w:rFonts w:cs="Mj_Casablanca Light"/>
+          <w:sz w:val="28"/>
+          <w:szCs w:val="28"/>
+          <w:lang w:bidi="fa-IR"/>
+        </w:rPr>
+      </w:pPr>
+      <w:r>
+        <w:rPr>
+          <w:rFonts w:cs="Mj_Casablanca Light"/>
+          <w:sz w:val="28"/>
+          <w:szCs w:val="28"/>
+          <w:rtl/>
+        </w:rPr>
+        <w:t>نام کسب‌وکار مدنظرش را در دسته‌بندی‌های مختلف جستجو کند</w:t>
+      </w:r>
+      <w:r>
+        <w:rPr>
+          <w:rFonts w:cs="Mj_Casablanca Light"/>
+          <w:sz w:val="28"/>
+          <w:szCs w:val="28"/>
+          <w:lang w:bidi="fa-IR"/>
+        </w:rPr>
+        <w:t xml:space="preserve">. </w:t>
+      </w:r>
+    </w:p>
+    <w:p>
+      <w:pPr>
+        <w:pStyle w:val="ListParagraph"/>
+        <w:numPr>
+          <w:ilvl w:val="0"/>
+          <w:numId w:val="6"/>
+        </w:numPr>
+        <w:bidi/>
+        <w:rPr>
+          <w:rFonts w:cs="Mj_Casablanca Light"/>
+          <w:sz w:val="28"/>
+          <w:szCs w:val="28"/>
+          <w:lang w:bidi="fa-IR"/>
+        </w:rPr>
+      </w:pPr>
+      <w:r>
+        <w:rPr>
+          <w:rFonts w:cs="Mj_Casablanca Light"/>
+          <w:sz w:val="28"/>
+          <w:szCs w:val="28"/>
+          <w:rtl/>
+        </w:rPr>
+        <w:t>پروفایل اختصاصی کسب‌وکار شامل سوابق، اطلاعات تماس و موقعیت مکانی را مشاهده و مطالعه کند</w:t>
+      </w:r>
+      <w:r>
+        <w:rPr>
+          <w:rFonts w:cs="Mj_Casablanca Light"/>
+          <w:sz w:val="28"/>
+          <w:szCs w:val="28"/>
+          <w:lang w:bidi="fa-IR"/>
+        </w:rPr>
+        <w:t xml:space="preserve">. </w:t>
+      </w:r>
+    </w:p>
+    <w:p>
+      <w:pPr>
+        <w:pStyle w:val="ListParagraph"/>
+        <w:numPr>
+          <w:ilvl w:val="0"/>
+          <w:numId w:val="6"/>
+        </w:numPr>
+        <w:bidi/>
+        <w:rPr>
+          <w:rFonts w:cs="Mj_Casablanca Light"/>
+          <w:sz w:val="28"/>
+          <w:szCs w:val="28"/>
+          <w:lang w:bidi="fa-IR"/>
+        </w:rPr>
+      </w:pPr>
+      <w:r>
+        <w:rPr>
+          <w:rFonts w:cs="Mj_Casablanca Light"/>
+          <w:sz w:val="28"/>
+          <w:szCs w:val="28"/>
+          <w:rtl/>
+        </w:rPr>
+        <w:t>نظرات سایر کاربران درباره کسب‌وکارها را بخواند و نظر خود را ثبت کند</w:t>
+      </w:r>
+      <w:r>
+        <w:rPr>
+          <w:rFonts w:cs="Mj_Casablanca Light"/>
+          <w:sz w:val="28"/>
+          <w:szCs w:val="28"/>
+          <w:lang w:bidi="fa-IR"/>
+        </w:rPr>
+        <w:t xml:space="preserve">. </w:t>
+      </w:r>
+    </w:p>
+    <w:p>
+      <w:pPr>
+        <w:pStyle w:val="ListParagraph"/>
+        <w:numPr>
+          <w:ilvl w:val="0"/>
+          <w:numId w:val="6"/>
+        </w:numPr>
+        <w:bidi/>
+        <w:rPr>
+          <w:rFonts w:cs="Mj_Casablanca Light"/>
+          <w:sz w:val="28"/>
+          <w:szCs w:val="28"/>
+          <w:lang w:bidi="fa-IR"/>
+        </w:rPr>
+      </w:pPr>
+      <w:r>
+        <w:rPr>
+          <w:rFonts w:cs="Mj_Casablanca Light"/>
+          <w:sz w:val="28"/>
+          <w:szCs w:val="28"/>
+          <w:rtl/>
+        </w:rPr>
+        <w:t>تقویم کاری و نوبت‌های خالی کسب‌وکار را ببیند و نوبت خود را رزرو کند</w:t>
+      </w:r>
+      <w:r>
+        <w:rPr>
+          <w:rFonts w:cs="Mj_Casablanca Light"/>
+          <w:sz w:val="28"/>
+          <w:szCs w:val="28"/>
+          <w:lang w:bidi="fa-IR"/>
+        </w:rPr>
+        <w:t xml:space="preserve">. </w:t>
+      </w:r>
+    </w:p>
+    <w:p>
+      <w:pPr>
+        <w:pStyle w:val="ListParagraph"/>
+        <w:numPr>
+          <w:ilvl w:val="0"/>
+          <w:numId w:val="6"/>
+        </w:numPr>
+        <w:bidi/>
+        <w:rPr>
+          <w:rFonts w:cs="Mj_Casablanca Light"/>
+          <w:sz w:val="28"/>
+          <w:szCs w:val="28"/>
+          <w:lang w:bidi="fa-IR"/>
+        </w:rPr>
+      </w:pPr>
+      <w:r>
+        <w:rPr>
+          <w:rFonts w:cs="Mj_Casablanca Light"/>
+          <w:sz w:val="28"/>
+          <w:szCs w:val="28"/>
+          <w:rtl/>
+        </w:rPr>
+        <w:t>لیست تمامی نوبت‌های رزرو شده و سوابق نوبت‌های قبلی خود را مدیریت کند</w:t>
+      </w:r>
+      <w:r>
+        <w:rPr>
+          <w:rFonts w:cs="Mj_Casablanca Light"/>
+          <w:sz w:val="28"/>
+          <w:szCs w:val="28"/>
+          <w:lang w:bidi="fa-IR"/>
+        </w:rPr>
+        <w:t xml:space="preserve">. </w:t>
+      </w:r>
+    </w:p>
+    <w:p>
+      <w:pPr>
+        <w:pStyle w:val="ListParagraph"/>
+        <w:numPr>
+          <w:ilvl w:val="0"/>
+          <w:numId w:val="6"/>
+        </w:numPr>
+        <w:bidi/>
+        <w:rPr>
+          <w:rFonts w:cs="Mj_Casablanca Light"/>
+          <w:sz w:val="28"/>
+          <w:szCs w:val="28"/>
+          <w:lang w:bidi="fa-IR"/>
+        </w:rPr>
+      </w:pPr>
+      <w:r>
+        <w:rPr>
+          <w:rFonts w:cs="Mj_Casablanca Light"/>
+          <w:sz w:val="28"/>
+          <w:szCs w:val="28"/>
+          <w:rtl/>
+        </w:rPr>
+        <w:t>بلافاصله پس از رزرو نوبت، پیامک تاییدیه دریافت کند</w:t>
+      </w:r>
+      <w:r>
+        <w:rPr>
+          <w:rFonts w:cs="Mj_Casablanca Light"/>
+          <w:sz w:val="28"/>
+          <w:szCs w:val="28"/>
+          <w:lang w:bidi="fa-IR"/>
+        </w:rPr>
+        <w:t xml:space="preserve">. </w:t>
+      </w:r>
+    </w:p>
+    <w:p>
+      <w:pPr>
+        <w:pStyle w:val="ListParagraph"/>
+        <w:numPr>
+          <w:ilvl w:val="0"/>
+          <w:numId w:val="6"/>
+        </w:numPr>
+        <w:bidi/>
+        <w:rPr>
+          <w:rFonts w:cs="Mj_Casablanca Light"/>
+          <w:sz w:val="28"/>
+          <w:szCs w:val="28"/>
+          <w:lang w:bidi="fa-IR"/>
+        </w:rPr>
+      </w:pPr>
+      <w:r>
+        <w:rPr>
+          <w:rFonts w:cs="Mj_Casablanca Light"/>
+          <w:sz w:val="28"/>
+          <w:szCs w:val="28"/>
+          <w:rtl/>
+        </w:rPr>
+        <w:t>موقعیت مکانی کسب‌وکارها را روی نقشه</w:t>
+      </w:r>
+      <w:r>
+        <w:rPr>
+          <w:rFonts w:cs="Mj_Casablanca Light"/>
+          <w:sz w:val="28"/>
+          <w:szCs w:val="28"/>
+          <w:lang w:bidi="fa-IR"/>
+        </w:rPr>
+        <w:t xml:space="preserve"> (Map) </w:t>
+      </w:r>
+      <w:r>
+        <w:rPr>
+          <w:rFonts w:cs="Mj_Casablanca Light"/>
+          <w:sz w:val="28"/>
+          <w:szCs w:val="28"/>
+          <w:rtl/>
+        </w:rPr>
+        <w:t>مشاهده کند</w:t>
+      </w:r>
+      <w:r>
+        <w:rPr>
+          <w:rFonts w:cs="Mj_Casablanca Light"/>
+          <w:sz w:val="28"/>
+          <w:szCs w:val="28"/>
+          <w:lang w:bidi="fa-IR"/>
+        </w:rPr>
+        <w:t xml:space="preserve">. </w:t>
+      </w:r>
+    </w:p>
+    <w:p>
+      <w:pPr>
+        <w:pStyle w:val="ListParagraph"/>
+        <w:numPr>
+          <w:ilvl w:val="0"/>
+          <w:numId w:val="6"/>
+        </w:numPr>
+        <w:bidi/>
+        <w:rPr>
+          <w:rFonts w:cs="Mj_Casablanca Light"/>
+          <w:sz w:val="28"/>
+          <w:szCs w:val="28"/>
+          <w:lang w:bidi="fa-IR"/>
+        </w:rPr>
+      </w:pPr>
+      <w:r>
+        <w:rPr>
+          <w:rFonts w:cs="Mj_Casablanca Light"/>
+          <w:sz w:val="28"/>
+          <w:szCs w:val="28"/>
+          <w:rtl/>
+        </w:rPr>
+        <w:t>کسب‌وکارها را بر اساس امتیاز (ستاره‌ها) یا نزدیکی به موقعیت مکانی خودش مرتب‌سازی</w:t>
+      </w:r>
+      <w:r>
+        <w:rPr>
+          <w:rFonts w:cs="Mj_Casablanca Light"/>
+          <w:sz w:val="28"/>
+          <w:szCs w:val="28"/>
+          <w:lang w:bidi="fa-IR"/>
+        </w:rPr>
+        <w:t xml:space="preserve"> (Sort) </w:t>
+      </w:r>
+      <w:r>
+        <w:rPr>
+          <w:rFonts w:cs="Mj_Casablanca Light"/>
+          <w:sz w:val="28"/>
+          <w:szCs w:val="28"/>
+          <w:rtl/>
+        </w:rPr>
+        <w:t>کند</w:t>
+      </w:r>
+      <w:r>
+        <w:rPr>
+          <w:rFonts w:cs="Mj_Casablanca Light"/>
+          <w:sz w:val="28"/>
+          <w:szCs w:val="28"/>
+          <w:lang w:bidi="fa-IR"/>
+        </w:rPr>
+        <w:t xml:space="preserve">. </w:t>
+      </w:r>
+    </w:p>
+    <w:p>
+      <w:pPr>
+        <w:pStyle w:val="ListParagraph"/>
+        <w:numPr>
+          <w:ilvl w:val="0"/>
+          <w:numId w:val="6"/>
+        </w:numPr>
+        <w:bidi/>
+        <w:rPr>
+          <w:rFonts w:cs="Mj_Casablanca Light"/>
+          <w:sz w:val="28"/>
+          <w:szCs w:val="28"/>
+          <w:lang w:bidi="fa-IR"/>
+        </w:rPr>
+      </w:pPr>
+      <w:r>
+        <w:rPr>
+          <w:rFonts w:cs="Mj_Casablanca Light"/>
+          <w:sz w:val="28"/>
+          <w:szCs w:val="28"/>
+          <w:rtl/>
+        </w:rPr>
+        <w:t>در صورت نیاز، تاریخ و ساعت نوبت رزرو شده خود را تغییر دهد</w:t>
+      </w:r>
+      <w:r>
+        <w:rPr>
+          <w:rFonts w:cs="Mj_Casablanca Light"/>
+          <w:sz w:val="28"/>
+          <w:szCs w:val="28"/>
+          <w:lang w:bidi="fa-IR"/>
+        </w:rPr>
+        <w:t xml:space="preserve"> (Reschedule) </w:t>
+      </w:r>
+      <w:r>
+        <w:rPr>
+          <w:rFonts w:cs="Mj_Casablanca Light"/>
+          <w:sz w:val="28"/>
+          <w:szCs w:val="28"/>
+          <w:rtl/>
+        </w:rPr>
+        <w:t>یا آن را لغو</w:t>
+      </w:r>
+      <w:r>
+        <w:rPr>
+          <w:rFonts w:cs="Mj_Casablanca Light"/>
+          <w:sz w:val="28"/>
+          <w:szCs w:val="28"/>
+          <w:lang w:bidi="fa-IR"/>
+        </w:rPr>
+        <w:t xml:space="preserve"> (Cancel) </w:t>
+      </w:r>
+      <w:r>
+        <w:rPr>
+          <w:rFonts w:cs="Mj_Casablanca Light"/>
+          <w:sz w:val="28"/>
+          <w:szCs w:val="28"/>
+          <w:rtl/>
+        </w:rPr>
+        <w:t>کند</w:t>
+      </w:r>
+      <w:r>
+        <w:rPr>
+          <w:rFonts w:cs="Mj_Casablanca Light"/>
+          <w:sz w:val="28"/>
+          <w:szCs w:val="28"/>
+          <w:lang w:bidi="fa-IR"/>
+        </w:rPr>
+        <w:t xml:space="preserve">. </w:t>
+      </w:r>
+    </w:p>
+    <w:p>
+      <w:pPr>
+        <w:pStyle w:val="ListParagraph"/>
+        <w:numPr>
+          <w:ilvl w:val="0"/>
+          <w:numId w:val="6"/>
+        </w:numPr>
+        <w:bidi/>
+        <w:rPr>
+          <w:rFonts w:cs="Mj_Casablanca Light"/>
+          <w:sz w:val="28"/>
+          <w:szCs w:val="28"/>
+          <w:rtl/>
+          <w:lang w:bidi="fa-IR"/>
+        </w:rPr>
+      </w:pPr>
+      <w:r>
+        <w:rPr>
+          <w:rFonts w:cs="Mj_Casablanca Light"/>
+          <w:sz w:val="28"/>
+          <w:szCs w:val="28"/>
+          <w:rtl/>
+        </w:rPr>
+        <w:t>از حریم خصوصی خود مطمئن باشد (عدم نمایش تمامی اطلاعات شخصی مشتری به کسب‌وکارها)</w:t>
+      </w:r>
+      <w:r>
+        <w:rPr>
+          <w:rFonts w:cs="Mj_Casablanca Light"/>
+          <w:sz w:val="28"/>
+          <w:szCs w:val="28"/>
+          <w:lang w:bidi="fa-IR"/>
+        </w:rPr>
+        <w:t xml:space="preserve">. </w:t>
+      </w:r>
+      <w:r>
+        <w:rPr>
+          <w:rFonts w:cs="Mj_Casablanca Light"/>
+          <w:color w:val="2E74B5" w:themeColor="accent5" w:themeShade="BF"/>
+          <w:sz w:val="32"/>
+          <w:szCs w:val="32"/>
+          <w:rtl/>
+          <w:lang w:bidi="fa-IR"/>
+        </w:rPr>
+        <w:br w:type="page"/>
+      </w:r>
+    </w:p>
+    <w:p>
+      <w:pPr>
+        <w:bidi/>
+        <w:rPr>
+          <w:rFonts w:cs="Mj_Casablanca Light"/>
+          <w:color w:val="00B0F0"/>
+          <w:sz w:val="36"/>
+          <w:szCs w:val="36"/>
+        </w:rPr>
+      </w:pPr>
+      <w:r>
+        <w:rPr>
+          <w:rFonts w:cs="Mj_Casablanca Light" w:hint="cs"/>
+          <w:b/>
+          <w:bCs/>
+          <w:color w:val="00B0F0"/>
+          <w:sz w:val="36"/>
+          <w:szCs w:val="36"/>
+          <w:rtl/>
+          <w:lang w:bidi="fa-IR"/>
+        </w:rPr>
+        <w:lastRenderedPageBreak/>
+        <w:t>۳. نیازمندی‌های کارمندان حضوری</w:t>
+      </w:r>
+    </w:p>
+    <w:p>
+      <w:pPr>
+        <w:bidi/>
+        <w:rPr>
+          <w:rFonts w:cs="Mj_Casablanca Light"/>
+          <w:sz w:val="32"/>
+          <w:szCs w:val="32"/>
+          <w:lang w:bidi="fa-IR"/>
+        </w:rPr>
+      </w:pPr>
+      <w:r>
+        <w:rPr>
+          <w:rFonts w:cs="Mj_Casablanca Light" w:hint="cs"/>
+          <w:sz w:val="32"/>
+          <w:szCs w:val="32"/>
+          <w:rtl/>
+          <w:lang w:bidi="fa-IR"/>
+        </w:rPr>
+        <w:t xml:space="preserve">کارمندان حضوری نیاز دارند که بتوانند </w:t>
+      </w:r>
+      <w:r>
+        <w:rPr>
+          <w:rFonts w:ascii="Arial" w:hAnsi="Arial" w:cs="Arial" w:hint="cs"/>
+          <w:sz w:val="32"/>
+          <w:szCs w:val="32"/>
+          <w:rtl/>
+          <w:lang w:bidi="fa-IR"/>
+        </w:rPr>
+        <w:t>…</w:t>
       </w:r>
     </w:p>
     <w:p>
@@ -545,52 +1249,125 @@
           <w:bCs/>
           <w:sz w:val="28"/>
           <w:szCs w:val="28"/>
-          <w:lang w:bidi="fa-IR"/>
-        </w:rPr>
-      </w:pPr>
-      <w:r>
-        <w:rPr>
-          <w:rFonts w:cs="Mj_Casablanca Light"/>
-          <w:b/>
-          <w:bCs/>
-          <w:sz w:val="28"/>
-          <w:szCs w:val="28"/>
-          <w:rtl/>
-        </w:rPr>
-        <w:t>در داشبورد خود، علاوه بر نوبت‌ها، بتواند وظایف</w:t>
-      </w:r>
-      <w:r>
-        <w:rPr>
-          <w:rFonts w:cs="Mj_Casablanca Light"/>
-          <w:b/>
-          <w:bCs/>
-          <w:sz w:val="28"/>
-          <w:szCs w:val="28"/>
-          <w:lang w:bidi="fa-IR"/>
-        </w:rPr>
-        <w:t xml:space="preserve"> (Tasks) </w:t>
-      </w:r>
-      <w:r>
-        <w:rPr>
-          <w:rFonts w:cs="Mj_Casablanca Light"/>
-          <w:b/>
-          <w:bCs/>
-          <w:sz w:val="28"/>
-          <w:szCs w:val="28"/>
-          <w:rtl/>
-        </w:rPr>
-        <w:t>و محتواهای تولید شده توسط کارمندانش را مدیریت کند</w:t>
-      </w:r>
-      <w:r>
-        <w:rPr>
-          <w:rFonts w:cs="Mj_Casablanca Light"/>
-          <w:b/>
-          <w:bCs/>
-          <w:sz w:val="28"/>
-          <w:szCs w:val="28"/>
+          <w:rtl/>
+        </w:rPr>
+      </w:pPr>
+      <w:r>
+        <w:rPr>
+          <w:rFonts w:cs="Mj_Casablanca Light" w:hint="cs"/>
+          <w:b/>
+          <w:bCs/>
+          <w:sz w:val="28"/>
+          <w:szCs w:val="28"/>
+          <w:rtl/>
+        </w:rPr>
+        <w:t>وارد پنل کاربری خود شده و تقویم و لیست نوبت‌های همان روز را مشاهده کنند</w:t>
+      </w:r>
+      <w:r>
+        <w:rPr>
+          <w:rFonts w:cs="Mj_Casablanca Light" w:hint="cs"/>
+          <w:b/>
+          <w:bCs/>
+          <w:sz w:val="28"/>
+          <w:szCs w:val="28"/>
+          <w:rtl/>
+        </w:rPr>
+        <w:t xml:space="preserve"> تا بتواند خدمات رو به درستي و با رعايت نوبت داده شده ؛ ارائه كند. </w:t>
+      </w:r>
+      <w:r>
+        <w:rPr>
+          <w:rFonts w:cs="Mj_Casablanca Light"/>
+          <w:b/>
+          <w:bCs/>
+          <w:sz w:val="28"/>
+          <w:szCs w:val="28"/>
+          <w:rtl/>
+          <w:lang w:bidi="fa-IR"/>
+        </w:rPr>
+        <w:br w:type="page"/>
+      </w:r>
+    </w:p>
+    <w:p>
+      <w:pPr>
+        <w:bidi/>
+        <w:rPr>
+          <w:rFonts w:cs="Mj_Casablanca Light"/>
+          <w:b/>
+          <w:bCs/>
+          <w:color w:val="00B0F0"/>
+          <w:sz w:val="36"/>
+          <w:szCs w:val="36"/>
+          <w:rtl/>
+        </w:rPr>
+      </w:pPr>
+      <w:r>
+        <w:rPr>
+          <w:rFonts w:cs="Mj_Casablanca Light"/>
+          <w:b/>
+          <w:bCs/>
+          <w:color w:val="00B0F0"/>
+          <w:sz w:val="36"/>
+          <w:szCs w:val="36"/>
+          <w:rtl/>
+          <w:lang w:bidi="fa-IR"/>
+        </w:rPr>
+        <w:lastRenderedPageBreak/>
+        <w:t>۴</w:t>
+      </w:r>
+      <w:r>
+        <w:rPr>
+          <w:rFonts w:cs="Mj_Casablanca Light"/>
+          <w:b/>
+          <w:bCs/>
+          <w:color w:val="00B0F0"/>
+          <w:sz w:val="36"/>
+          <w:szCs w:val="36"/>
           <w:lang w:bidi="fa-IR"/>
         </w:rPr>
         <w:t xml:space="preserve">. </w:t>
+      </w:r>
+      <w:r>
+        <w:rPr>
+          <w:rFonts w:cs="Mj_Casablanca Light"/>
+          <w:b/>
+          <w:bCs/>
+          <w:color w:val="00B0F0"/>
+          <w:sz w:val="36"/>
+          <w:szCs w:val="36"/>
+          <w:rtl/>
+        </w:rPr>
+        <w:t>نیازمندی‌های کارمندان پشتیبانی بخش آنلاین</w:t>
+      </w:r>
+    </w:p>
+    <w:p>
+      <w:pPr>
+        <w:bidi/>
+        <w:rPr>
+          <w:rFonts w:cs="Mj_Casablanca Light"/>
+          <w:sz w:val="32"/>
+          <w:szCs w:val="32"/>
+          <w:lang w:bidi="fa-IR"/>
+        </w:rPr>
+      </w:pPr>
+      <w:r>
+        <w:rPr>
+          <w:rFonts w:cs="Mj_Casablanca Light" w:hint="cs"/>
+          <w:sz w:val="32"/>
+          <w:szCs w:val="32"/>
+          <w:rtl/>
+          <w:lang w:bidi="fa-IR"/>
+        </w:rPr>
+        <w:t xml:space="preserve">کارمندان پشتیبانی آنلاین نیاز دارند که بتوانند </w:t>
+      </w:r>
+      <w:r>
+        <w:rPr>
+          <w:rFonts w:ascii="Arial" w:hAnsi="Arial" w:cs="Arial" w:hint="cs"/>
+          <w:sz w:val="32"/>
+          <w:szCs w:val="32"/>
+          <w:rtl/>
+          <w:lang w:bidi="fa-IR"/>
+        </w:rPr>
+        <w:t>…</w:t>
       </w:r>
     </w:p>
     <w:p>
@@ -607,50 +1384,26 @@
           <w:bCs/>
           <w:sz w:val="28"/>
           <w:szCs w:val="28"/>
-          <w:lang w:bidi="fa-IR"/>
-        </w:rPr>
-      </w:pPr>
-      <w:r>
-        <w:rPr>
-          <w:rFonts w:cs="Mj_Casablanca Light"/>
-          <w:b/>
-          <w:bCs/>
-          <w:sz w:val="28"/>
-          <w:szCs w:val="28"/>
-          <w:rtl/>
-        </w:rPr>
-        <w:t>به صفحه گزارش‌های اختصاصی</w:t>
-      </w:r>
-      <w:r>
-        <w:rPr>
-          <w:rFonts w:cs="Mj_Casablanca Light"/>
-          <w:b/>
-          <w:bCs/>
-          <w:sz w:val="28"/>
-          <w:szCs w:val="28"/>
-          <w:lang w:bidi="fa-IR"/>
-        </w:rPr>
-        <w:t xml:space="preserve"> (Reports) </w:t>
-      </w:r>
-      <w:r>
-        <w:rPr>
-          <w:rFonts w:cs="Mj_Casablanca Light"/>
-          <w:b/>
-          <w:bCs/>
-          <w:sz w:val="28"/>
-          <w:szCs w:val="28"/>
-          <w:rtl/>
-        </w:rPr>
-        <w:t>برای بررسی دقیق وضعیت مالی و عملکردی کسب‌وکار دسترسی داشته باشد</w:t>
-      </w:r>
-      <w:r>
-        <w:rPr>
-          <w:rFonts w:cs="Mj_Casablanca Light"/>
-          <w:b/>
-          <w:bCs/>
-          <w:sz w:val="28"/>
-          <w:szCs w:val="28"/>
-          <w:lang w:bidi="fa-IR"/>
+        </w:rPr>
+      </w:pPr>
+      <w:r>
+        <w:rPr>
+          <w:rFonts w:cs="Mj_Casablanca Light"/>
+          <w:b/>
+          <w:bCs/>
+          <w:sz w:val="28"/>
+          <w:szCs w:val="28"/>
+          <w:rtl/>
+        </w:rPr>
+        <w:t>اطلاعیه‌ها، اخبار و تبلیغات جدید کسب‌وکار را در صفحه اختصاصی سایت منتشر کنند</w:t>
+      </w:r>
+      <w:r>
+        <w:rPr>
+          <w:rFonts w:cs="Mj_Casablanca Light"/>
+          <w:b/>
+          <w:bCs/>
+          <w:sz w:val="28"/>
+          <w:szCs w:val="28"/>
         </w:rPr>
         <w:t xml:space="preserve">. </w:t>
       </w:r>
@@ -669,855 +1422,28 @@
           <w:bCs/>
           <w:sz w:val="28"/>
           <w:szCs w:val="28"/>
-          <w:rtl/>
-          <w:lang w:bidi="fa-IR"/>
-        </w:rPr>
-      </w:pPr>
-      <w:r>
-        <w:rPr>
-          <w:rFonts w:cs="Mj_Casablanca Light"/>
-          <w:b/>
-          <w:bCs/>
-          <w:sz w:val="28"/>
-          <w:szCs w:val="28"/>
-          <w:rtl/>
-        </w:rPr>
-        <w:t>نوبت‌ها را در قالب یک نوار زمان</w:t>
-      </w:r>
-      <w:r>
-        <w:rPr>
-          <w:rFonts w:cs="Mj_Casablanca Light"/>
-          <w:b/>
-          <w:bCs/>
-          <w:sz w:val="28"/>
-          <w:szCs w:val="28"/>
-          <w:lang w:bidi="fa-IR"/>
-        </w:rPr>
-        <w:t xml:space="preserve"> (Timeline) </w:t>
-      </w:r>
-      <w:r>
-        <w:rPr>
-          <w:rFonts w:cs="Mj_Casablanca Light"/>
-          <w:b/>
-          <w:bCs/>
-          <w:sz w:val="28"/>
-          <w:szCs w:val="28"/>
-          <w:rtl/>
-        </w:rPr>
-        <w:t>مشاهده کند</w:t>
-      </w:r>
-      <w:r>
-        <w:rPr>
-          <w:rFonts w:cs="Mj_Casablanca Light"/>
-          <w:b/>
-          <w:bCs/>
-          <w:sz w:val="28"/>
-          <w:szCs w:val="28"/>
-          <w:lang w:bidi="fa-IR"/>
-        </w:rPr>
-        <w:t>.</w:t>
-      </w:r>
-    </w:p>
-    <w:p>
-      <w:pPr>
-        <w:bidi/>
-        <w:rPr>
-          <w:rFonts w:cs="Mj_Casablanca Light" w:hint="cs"/>
-          <w:color w:val="00B0F0"/>
-          <w:sz w:val="36"/>
-          <w:szCs w:val="36"/>
-          <w:rtl/>
-          <w:lang w:bidi="fa-IR"/>
-        </w:rPr>
-      </w:pPr>
-      <w:r>
-        <w:rPr>
-          <w:rFonts w:cs="Mj_Casablanca Light" w:hint="cs"/>
-          <w:color w:val="00B0F0"/>
-          <w:sz w:val="36"/>
-          <w:szCs w:val="36"/>
-          <w:rtl/>
-          <w:lang w:bidi="fa-IR"/>
-        </w:rPr>
-        <w:lastRenderedPageBreak/>
-        <w:t>2</w:t>
-      </w:r>
-      <w:r>
-        <w:rPr>
-          <w:rFonts w:cs="Mj_Casablanca Light"/>
-          <w:color w:val="00B0F0"/>
-          <w:sz w:val="36"/>
-          <w:szCs w:val="36"/>
-          <w:lang w:bidi="fa-IR"/>
+        </w:rPr>
+      </w:pPr>
+      <w:r>
+        <w:rPr>
+          <w:rFonts w:cs="Mj_Casablanca Light"/>
+          <w:b/>
+          <w:bCs/>
+          <w:sz w:val="28"/>
+          <w:szCs w:val="28"/>
+          <w:rtl/>
+        </w:rPr>
+        <w:t>اطلاعات پروفایل کسب‌وکار (مثل ساعات کاری یا راه‌های ارتباطی) را در صورت نیاز به‌روزرسانی کنند</w:t>
+      </w:r>
+      <w:r>
+        <w:rPr>
+          <w:rFonts w:cs="Mj_Casablanca Light"/>
+          <w:b/>
+          <w:bCs/>
+          <w:sz w:val="28"/>
+          <w:szCs w:val="28"/>
         </w:rPr>
         <w:t xml:space="preserve">. </w:t>
-      </w:r>
-      <w:r>
-        <w:rPr>
-          <w:rFonts w:cs="Mj_Casablanca Light"/>
-          <w:color w:val="00B0F0"/>
-          <w:sz w:val="36"/>
-          <w:szCs w:val="36"/>
-          <w:rtl/>
-        </w:rPr>
-        <w:t>نیازمندی‌های مشتری</w:t>
-      </w:r>
-    </w:p>
-    <w:p>
-      <w:pPr>
-        <w:bidi/>
-        <w:rPr>
-          <w:rFonts w:ascii="Arial" w:hAnsi="Arial" w:cs="Arial"/>
-          <w:sz w:val="32"/>
-          <w:szCs w:val="32"/>
-          <w:rtl/>
-          <w:lang w:bidi="fa-IR"/>
-        </w:rPr>
-      </w:pPr>
-      <w:r>
-        <w:rPr>
-          <w:rFonts w:cs="Mj_Casablanca Light" w:hint="cs"/>
-          <w:sz w:val="32"/>
-          <w:szCs w:val="32"/>
-          <w:rtl/>
-          <w:lang w:bidi="fa-IR"/>
-        </w:rPr>
-        <w:t xml:space="preserve">مشتري نياز دارد كه </w:t>
-      </w:r>
-      <w:r>
-        <w:rPr>
-          <w:rFonts w:cs="Mj_Casablanca Light" w:hint="cs"/>
-          <w:sz w:val="32"/>
-          <w:szCs w:val="32"/>
-          <w:rtl/>
-          <w:lang w:bidi="fa-IR"/>
-        </w:rPr>
-        <w:t xml:space="preserve">بتواند </w:t>
-      </w:r>
-      <w:r>
-        <w:rPr>
-          <w:rFonts w:ascii="Arial" w:hAnsi="Arial" w:cs="Arial" w:hint="cs"/>
-          <w:sz w:val="32"/>
-          <w:szCs w:val="32"/>
-          <w:rtl/>
-          <w:lang w:bidi="fa-IR"/>
-        </w:rPr>
-        <w:t>…</w:t>
-      </w:r>
-    </w:p>
-    <w:p>
-      <w:pPr>
-        <w:pStyle w:val="ListParagraph"/>
-        <w:numPr>
-          <w:ilvl w:val="0"/>
-          <w:numId w:val="6"/>
-        </w:numPr>
-        <w:bidi/>
-        <w:rPr>
-          <w:rFonts w:cs="Mj_Casablanca Light"/>
-          <w:sz w:val="28"/>
-          <w:szCs w:val="28"/>
-          <w:lang w:bidi="fa-IR"/>
-        </w:rPr>
-      </w:pPr>
-      <w:r>
-        <w:rPr>
-          <w:rFonts w:cs="Mj_Casablanca Light"/>
-          <w:sz w:val="28"/>
-          <w:szCs w:val="28"/>
-          <w:rtl/>
-        </w:rPr>
-        <w:t>در سایت ثبت‌نام کرده و وارد حساب کاربری خود شود</w:t>
-      </w:r>
-      <w:r>
-        <w:rPr>
-          <w:rFonts w:cs="Mj_Casablanca Light"/>
-          <w:sz w:val="28"/>
-          <w:szCs w:val="28"/>
-          <w:lang w:bidi="fa-IR"/>
-        </w:rPr>
-        <w:t xml:space="preserve"> (Login/Register). </w:t>
-      </w:r>
-    </w:p>
-    <w:p>
-      <w:pPr>
-        <w:pStyle w:val="ListParagraph"/>
-        <w:numPr>
-          <w:ilvl w:val="0"/>
-          <w:numId w:val="6"/>
-        </w:numPr>
-        <w:bidi/>
-        <w:rPr>
-          <w:rFonts w:cs="Mj_Casablanca Light"/>
-          <w:sz w:val="28"/>
-          <w:szCs w:val="28"/>
-          <w:lang w:bidi="fa-IR"/>
-        </w:rPr>
-      </w:pPr>
-      <w:r>
-        <w:rPr>
-          <w:rFonts w:cs="Mj_Casablanca Light"/>
-          <w:sz w:val="28"/>
-          <w:szCs w:val="28"/>
-          <w:rtl/>
-        </w:rPr>
-        <w:t>کسب‌وکارها را بر اساس دسته‌بندی، خدمات و موقعیت فیلتر کند</w:t>
-      </w:r>
-      <w:r>
-        <w:rPr>
-          <w:rFonts w:cs="Mj_Casablanca Light"/>
-          <w:sz w:val="28"/>
-          <w:szCs w:val="28"/>
-          <w:lang w:bidi="fa-IR"/>
-        </w:rPr>
-        <w:t xml:space="preserve">. </w:t>
-      </w:r>
-    </w:p>
-    <w:p>
-      <w:pPr>
-        <w:pStyle w:val="ListParagraph"/>
-        <w:numPr>
-          <w:ilvl w:val="0"/>
-          <w:numId w:val="6"/>
-        </w:numPr>
-        <w:bidi/>
-        <w:rPr>
-          <w:rFonts w:cs="Mj_Casablanca Light"/>
-          <w:sz w:val="28"/>
-          <w:szCs w:val="28"/>
-          <w:lang w:bidi="fa-IR"/>
-        </w:rPr>
-      </w:pPr>
-      <w:r>
-        <w:rPr>
-          <w:rFonts w:cs="Mj_Casablanca Light"/>
-          <w:sz w:val="28"/>
-          <w:szCs w:val="28"/>
-          <w:rtl/>
-        </w:rPr>
-        <w:t>نام کسب‌وکار مدنظرش را در دسته‌بندی‌های مختلف جستجو کند</w:t>
-      </w:r>
-      <w:r>
-        <w:rPr>
-          <w:rFonts w:cs="Mj_Casablanca Light"/>
-          <w:sz w:val="28"/>
-          <w:szCs w:val="28"/>
-          <w:lang w:bidi="fa-IR"/>
-        </w:rPr>
-        <w:t xml:space="preserve">. </w:t>
-      </w:r>
-    </w:p>
-    <w:p>
-      <w:pPr>
-        <w:pStyle w:val="ListParagraph"/>
-        <w:numPr>
-          <w:ilvl w:val="0"/>
-          <w:numId w:val="6"/>
-        </w:numPr>
-        <w:bidi/>
-        <w:rPr>
-          <w:rFonts w:cs="Mj_Casablanca Light"/>
-          <w:sz w:val="28"/>
-          <w:szCs w:val="28"/>
-          <w:lang w:bidi="fa-IR"/>
-        </w:rPr>
-      </w:pPr>
-      <w:r>
-        <w:rPr>
-          <w:rFonts w:cs="Mj_Casablanca Light"/>
-          <w:sz w:val="28"/>
-          <w:szCs w:val="28"/>
-          <w:rtl/>
-        </w:rPr>
-        <w:t>پروفایل اختصاصی کسب‌وکار شامل سوابق، اطلاعات تماس و موقعیت مکانی را مشاهده و مطالعه کند</w:t>
-      </w:r>
-      <w:r>
-        <w:rPr>
-          <w:rFonts w:cs="Mj_Casablanca Light"/>
-          <w:sz w:val="28"/>
-          <w:szCs w:val="28"/>
-          <w:lang w:bidi="fa-IR"/>
-        </w:rPr>
-        <w:t xml:space="preserve">. </w:t>
-      </w:r>
-    </w:p>
-    <w:p>
-      <w:pPr>
-        <w:pStyle w:val="ListParagraph"/>
-        <w:numPr>
-          <w:ilvl w:val="0"/>
-          <w:numId w:val="6"/>
-        </w:numPr>
-        <w:bidi/>
-        <w:rPr>
-          <w:rFonts w:cs="Mj_Casablanca Light"/>
-          <w:sz w:val="28"/>
-          <w:szCs w:val="28"/>
-          <w:lang w:bidi="fa-IR"/>
-        </w:rPr>
-      </w:pPr>
-      <w:r>
-        <w:rPr>
-          <w:rFonts w:cs="Mj_Casablanca Light"/>
-          <w:sz w:val="28"/>
-          <w:szCs w:val="28"/>
-          <w:rtl/>
-        </w:rPr>
-        <w:t>نظرات سایر کاربران درباره کسب‌وکارها را بخواند و نظر خود را ثبت کند</w:t>
-      </w:r>
-      <w:r>
-        <w:rPr>
-          <w:rFonts w:cs="Mj_Casablanca Light"/>
-          <w:sz w:val="28"/>
-          <w:szCs w:val="28"/>
-          <w:lang w:bidi="fa-IR"/>
-        </w:rPr>
-        <w:t xml:space="preserve">. </w:t>
-      </w:r>
-    </w:p>
-    <w:p>
-      <w:pPr>
-        <w:pStyle w:val="ListParagraph"/>
-        <w:numPr>
-          <w:ilvl w:val="0"/>
-          <w:numId w:val="6"/>
-        </w:numPr>
-        <w:bidi/>
-        <w:rPr>
-          <w:rFonts w:cs="Mj_Casablanca Light"/>
-          <w:sz w:val="28"/>
-          <w:szCs w:val="28"/>
-          <w:lang w:bidi="fa-IR"/>
-        </w:rPr>
-      </w:pPr>
-      <w:r>
-        <w:rPr>
-          <w:rFonts w:cs="Mj_Casablanca Light"/>
-          <w:sz w:val="28"/>
-          <w:szCs w:val="28"/>
-          <w:rtl/>
-        </w:rPr>
-        <w:t>از طریق چت آنلاین با پشتیبانی کسب‌وکار ارتباط بگیرد و سوالات خود را بپرسد</w:t>
-      </w:r>
-      <w:r>
-        <w:rPr>
-          <w:rFonts w:cs="Mj_Casablanca Light"/>
-          <w:sz w:val="28"/>
-          <w:szCs w:val="28"/>
-          <w:lang w:bidi="fa-IR"/>
-        </w:rPr>
-        <w:t xml:space="preserve">. </w:t>
-      </w:r>
-    </w:p>
-    <w:p>
-      <w:pPr>
-        <w:pStyle w:val="ListParagraph"/>
-        <w:numPr>
-          <w:ilvl w:val="0"/>
-          <w:numId w:val="6"/>
-        </w:numPr>
-        <w:bidi/>
-        <w:rPr>
-          <w:rFonts w:cs="Mj_Casablanca Light"/>
-          <w:sz w:val="28"/>
-          <w:szCs w:val="28"/>
-          <w:lang w:bidi="fa-IR"/>
-        </w:rPr>
-      </w:pPr>
-      <w:r>
-        <w:rPr>
-          <w:rFonts w:cs="Mj_Casablanca Light"/>
-          <w:sz w:val="28"/>
-          <w:szCs w:val="28"/>
-          <w:rtl/>
-        </w:rPr>
-        <w:t>تقویم کاری و نوبت‌های خالی کسب‌وکار را ببیند و نوبت خود را رزرو کند</w:t>
-      </w:r>
-      <w:r>
-        <w:rPr>
-          <w:rFonts w:cs="Mj_Casablanca Light"/>
-          <w:sz w:val="28"/>
-          <w:szCs w:val="28"/>
-          <w:lang w:bidi="fa-IR"/>
-        </w:rPr>
-        <w:t xml:space="preserve">. </w:t>
-      </w:r>
-    </w:p>
-    <w:p>
-      <w:pPr>
-        <w:pStyle w:val="ListParagraph"/>
-        <w:numPr>
-          <w:ilvl w:val="0"/>
-          <w:numId w:val="6"/>
-        </w:numPr>
-        <w:bidi/>
-        <w:rPr>
-          <w:rFonts w:cs="Mj_Casablanca Light"/>
-          <w:sz w:val="28"/>
-          <w:szCs w:val="28"/>
-          <w:lang w:bidi="fa-IR"/>
-        </w:rPr>
-      </w:pPr>
-      <w:r>
-        <w:rPr>
-          <w:rFonts w:cs="Mj_Casablanca Light"/>
-          <w:sz w:val="28"/>
-          <w:szCs w:val="28"/>
-          <w:rtl/>
-        </w:rPr>
-        <w:t>لیست تمامی نوبت‌های رزرو شده و سوابق نوبت‌های قبلی خود را مدیریت کند</w:t>
-      </w:r>
-      <w:r>
-        <w:rPr>
-          <w:rFonts w:cs="Mj_Casablanca Light"/>
-          <w:sz w:val="28"/>
-          <w:szCs w:val="28"/>
-          <w:lang w:bidi="fa-IR"/>
-        </w:rPr>
-        <w:t xml:space="preserve">. </w:t>
-      </w:r>
-    </w:p>
-    <w:p>
-      <w:pPr>
-        <w:pStyle w:val="ListParagraph"/>
-        <w:numPr>
-          <w:ilvl w:val="0"/>
-          <w:numId w:val="6"/>
-        </w:numPr>
-        <w:bidi/>
-        <w:rPr>
-          <w:rFonts w:cs="Mj_Casablanca Light"/>
-          <w:sz w:val="28"/>
-          <w:szCs w:val="28"/>
-          <w:lang w:bidi="fa-IR"/>
-        </w:rPr>
-      </w:pPr>
-      <w:r>
-        <w:rPr>
-          <w:rFonts w:cs="Mj_Casablanca Light"/>
-          <w:sz w:val="28"/>
-          <w:szCs w:val="28"/>
-          <w:rtl/>
-        </w:rPr>
-        <w:t>بلافاصله پس از رزرو نوبت، پیامک تاییدیه دریافت کند</w:t>
-      </w:r>
-      <w:r>
-        <w:rPr>
-          <w:rFonts w:cs="Mj_Casablanca Light"/>
-          <w:sz w:val="28"/>
-          <w:szCs w:val="28"/>
-          <w:lang w:bidi="fa-IR"/>
-        </w:rPr>
-        <w:t xml:space="preserve">. </w:t>
-      </w:r>
-    </w:p>
-    <w:p>
-      <w:pPr>
-        <w:pStyle w:val="ListParagraph"/>
-        <w:numPr>
-          <w:ilvl w:val="0"/>
-          <w:numId w:val="6"/>
-        </w:numPr>
-        <w:bidi/>
-        <w:rPr>
-          <w:rFonts w:cs="Mj_Casablanca Light"/>
-          <w:sz w:val="28"/>
-          <w:szCs w:val="28"/>
-          <w:lang w:bidi="fa-IR"/>
-        </w:rPr>
-      </w:pPr>
-      <w:r>
-        <w:rPr>
-          <w:rFonts w:cs="Mj_Casablanca Light"/>
-          <w:sz w:val="28"/>
-          <w:szCs w:val="28"/>
-          <w:rtl/>
-          <w:lang w:bidi="fa-IR"/>
-        </w:rPr>
-        <w:t>۲۴</w:t>
-      </w:r>
-      <w:r>
-        <w:rPr>
-          <w:rFonts w:cs="Mj_Casablanca Light"/>
-          <w:sz w:val="28"/>
-          <w:szCs w:val="28"/>
-          <w:lang w:bidi="fa-IR"/>
-        </w:rPr>
-        <w:t xml:space="preserve"> </w:t>
-      </w:r>
-      <w:r>
-        <w:rPr>
-          <w:rFonts w:cs="Mj_Casablanca Light"/>
-          <w:sz w:val="28"/>
-          <w:szCs w:val="28"/>
-          <w:rtl/>
-        </w:rPr>
-        <w:t>ساعت قبل از زمان نوبت، پیامک یادآوری دریافت کند</w:t>
-      </w:r>
-      <w:r>
-        <w:rPr>
-          <w:rFonts w:cs="Mj_Casablanca Light"/>
-          <w:sz w:val="28"/>
-          <w:szCs w:val="28"/>
-          <w:lang w:bidi="fa-IR"/>
-        </w:rPr>
-        <w:t>.</w:t>
-      </w:r>
-    </w:p>
-    <w:p>
-      <w:pPr>
-        <w:pStyle w:val="ListParagraph"/>
-        <w:numPr>
-          <w:ilvl w:val="0"/>
-          <w:numId w:val="6"/>
-        </w:numPr>
-        <w:bidi/>
-        <w:rPr>
-          <w:rFonts w:cs="Mj_Casablanca Light"/>
-          <w:sz w:val="28"/>
-          <w:szCs w:val="28"/>
-          <w:lang w:bidi="fa-IR"/>
-        </w:rPr>
-      </w:pPr>
-      <w:r>
-        <w:rPr>
-          <w:rFonts w:cs="Mj_Casablanca Light"/>
-          <w:sz w:val="28"/>
-          <w:szCs w:val="28"/>
-          <w:rtl/>
-        </w:rPr>
-        <w:t>موقعیت مکانی کسب‌وکارها را روی نقشه</w:t>
-      </w:r>
-      <w:r>
-        <w:rPr>
-          <w:rFonts w:cs="Mj_Casablanca Light"/>
-          <w:sz w:val="28"/>
-          <w:szCs w:val="28"/>
-          <w:lang w:bidi="fa-IR"/>
-        </w:rPr>
-        <w:t xml:space="preserve"> (Map) </w:t>
-      </w:r>
-      <w:r>
-        <w:rPr>
-          <w:rFonts w:cs="Mj_Casablanca Light"/>
-          <w:sz w:val="28"/>
-          <w:szCs w:val="28"/>
-          <w:rtl/>
-        </w:rPr>
-        <w:t>مشاهده کند</w:t>
-      </w:r>
-      <w:r>
-        <w:rPr>
-          <w:rFonts w:cs="Mj_Casablanca Light"/>
-          <w:sz w:val="28"/>
-          <w:szCs w:val="28"/>
-          <w:lang w:bidi="fa-IR"/>
-        </w:rPr>
-        <w:t xml:space="preserve">. </w:t>
-      </w:r>
-    </w:p>
-    <w:p>
-      <w:pPr>
-        <w:pStyle w:val="ListParagraph"/>
-        <w:numPr>
-          <w:ilvl w:val="0"/>
-          <w:numId w:val="6"/>
-        </w:numPr>
-        <w:bidi/>
-        <w:rPr>
-          <w:rFonts w:cs="Mj_Casablanca Light"/>
-          <w:sz w:val="28"/>
-          <w:szCs w:val="28"/>
-          <w:lang w:bidi="fa-IR"/>
-        </w:rPr>
-      </w:pPr>
-      <w:r>
-        <w:rPr>
-          <w:rFonts w:cs="Mj_Casablanca Light"/>
-          <w:sz w:val="28"/>
-          <w:szCs w:val="28"/>
-          <w:rtl/>
-        </w:rPr>
-        <w:t>کسب‌وکارها را بر اساس امتیاز (ستاره‌ها) یا نزدیکی به موقعیت مکانی خودش مرتب‌سازی</w:t>
-      </w:r>
-      <w:r>
-        <w:rPr>
-          <w:rFonts w:cs="Mj_Casablanca Light"/>
-          <w:sz w:val="28"/>
-          <w:szCs w:val="28"/>
-          <w:lang w:bidi="fa-IR"/>
-        </w:rPr>
-        <w:t xml:space="preserve"> (Sort) </w:t>
-      </w:r>
-      <w:r>
-        <w:rPr>
-          <w:rFonts w:cs="Mj_Casablanca Light"/>
-          <w:sz w:val="28"/>
-          <w:szCs w:val="28"/>
-          <w:rtl/>
-        </w:rPr>
-        <w:t>کند</w:t>
-      </w:r>
-      <w:r>
-        <w:rPr>
-          <w:rFonts w:cs="Mj_Casablanca Light"/>
-          <w:sz w:val="28"/>
-          <w:szCs w:val="28"/>
-          <w:lang w:bidi="fa-IR"/>
-        </w:rPr>
-        <w:t xml:space="preserve">. </w:t>
-      </w:r>
-    </w:p>
-    <w:p>
-      <w:pPr>
-        <w:pStyle w:val="ListParagraph"/>
-        <w:numPr>
-          <w:ilvl w:val="0"/>
-          <w:numId w:val="6"/>
-        </w:numPr>
-        <w:bidi/>
-        <w:rPr>
-          <w:rFonts w:cs="Mj_Casablanca Light"/>
-          <w:sz w:val="28"/>
-          <w:szCs w:val="28"/>
-          <w:lang w:bidi="fa-IR"/>
-        </w:rPr>
-      </w:pPr>
-      <w:r>
-        <w:rPr>
-          <w:rFonts w:cs="Mj_Casablanca Light"/>
-          <w:sz w:val="28"/>
-          <w:szCs w:val="28"/>
-          <w:rtl/>
-        </w:rPr>
-        <w:t>در صورت نیاز، تاریخ و ساعت نوبت رزرو شده خود را تغییر دهد</w:t>
-      </w:r>
-      <w:r>
-        <w:rPr>
-          <w:rFonts w:cs="Mj_Casablanca Light"/>
-          <w:sz w:val="28"/>
-          <w:szCs w:val="28"/>
-          <w:lang w:bidi="fa-IR"/>
-        </w:rPr>
-        <w:t xml:space="preserve"> (Reschedule) </w:t>
-      </w:r>
-      <w:r>
-        <w:rPr>
-          <w:rFonts w:cs="Mj_Casablanca Light"/>
-          <w:sz w:val="28"/>
-          <w:szCs w:val="28"/>
-          <w:rtl/>
-        </w:rPr>
-        <w:t>یا آن را لغو</w:t>
-      </w:r>
-      <w:r>
-        <w:rPr>
-          <w:rFonts w:cs="Mj_Casablanca Light"/>
-          <w:sz w:val="28"/>
-          <w:szCs w:val="28"/>
-          <w:lang w:bidi="fa-IR"/>
-        </w:rPr>
-        <w:t xml:space="preserve"> (Cancel) </w:t>
-      </w:r>
-      <w:r>
-        <w:rPr>
-          <w:rFonts w:cs="Mj_Casablanca Light"/>
-          <w:sz w:val="28"/>
-          <w:szCs w:val="28"/>
-          <w:rtl/>
-        </w:rPr>
-        <w:t>کند</w:t>
-      </w:r>
-      <w:r>
-        <w:rPr>
-          <w:rFonts w:cs="Mj_Casablanca Light"/>
-          <w:sz w:val="28"/>
-          <w:szCs w:val="28"/>
-          <w:lang w:bidi="fa-IR"/>
-        </w:rPr>
-        <w:t xml:space="preserve">. </w:t>
-      </w:r>
-    </w:p>
-    <w:p>
-      <w:pPr>
-        <w:pStyle w:val="ListParagraph"/>
-        <w:numPr>
-          <w:ilvl w:val="0"/>
-          <w:numId w:val="6"/>
-        </w:numPr>
-        <w:bidi/>
-        <w:rPr>
-          <w:rFonts w:cs="Mj_Casablanca Light"/>
-          <w:sz w:val="28"/>
-          <w:szCs w:val="28"/>
-          <w:lang w:bidi="fa-IR"/>
-        </w:rPr>
-      </w:pPr>
-      <w:r>
-        <w:rPr>
-          <w:rFonts w:cs="Mj_Casablanca Light"/>
-          <w:sz w:val="28"/>
-          <w:szCs w:val="28"/>
-          <w:rtl/>
-        </w:rPr>
-        <w:t>از حریم خصوصی خود مطمئن باشد (عدم نمایش تمامی اطلاعات شخصی مشتری به کسب‌وکارها)</w:t>
-      </w:r>
-      <w:r>
-        <w:rPr>
-          <w:rFonts w:cs="Mj_Casablanca Light"/>
-          <w:sz w:val="28"/>
-          <w:szCs w:val="28"/>
-          <w:lang w:bidi="fa-IR"/>
-        </w:rPr>
-        <w:t xml:space="preserve">. </w:t>
-      </w:r>
-    </w:p>
-    <w:p>
-      <w:pPr>
-        <w:pStyle w:val="ListParagraph"/>
-        <w:numPr>
-          <w:ilvl w:val="0"/>
-          <w:numId w:val="6"/>
-        </w:numPr>
-        <w:bidi/>
-        <w:rPr>
-          <w:rFonts w:cs="Mj_Casablanca Light"/>
-          <w:sz w:val="28"/>
-          <w:szCs w:val="28"/>
-          <w:lang w:bidi="fa-IR"/>
-        </w:rPr>
-      </w:pPr>
-      <w:r>
-        <w:rPr>
-          <w:rFonts w:cs="Mj_Casablanca Light"/>
-          <w:sz w:val="28"/>
-          <w:szCs w:val="28"/>
-          <w:rtl/>
-        </w:rPr>
-        <w:t>علاوه بر پشتیبانی کسب‌وکار، بتواند با پشتیبانی کل سایت (پلتفرم) نیز چت کند</w:t>
-      </w:r>
-      <w:r>
-        <w:rPr>
-          <w:rFonts w:cs="Mj_Casablanca Light"/>
-          <w:sz w:val="28"/>
-          <w:szCs w:val="28"/>
-          <w:lang w:bidi="fa-IR"/>
-        </w:rPr>
-        <w:t xml:space="preserve">. </w:t>
-      </w:r>
-    </w:p>
-    <w:p>
-      <w:pPr>
-        <w:pStyle w:val="ListParagraph"/>
-        <w:numPr>
-          <w:ilvl w:val="0"/>
-          <w:numId w:val="6"/>
-        </w:numPr>
-        <w:bidi/>
-        <w:rPr>
-          <w:rFonts w:cs="Mj_Casablanca Light"/>
-          <w:sz w:val="28"/>
-          <w:szCs w:val="28"/>
-          <w:rtl/>
-          <w:lang w:bidi="fa-IR"/>
-        </w:rPr>
-      </w:pPr>
-      <w:r>
-        <w:rPr>
-          <w:rFonts w:cs="Mj_Casablanca Light"/>
-          <w:sz w:val="28"/>
-          <w:szCs w:val="28"/>
-          <w:rtl/>
-        </w:rPr>
-        <w:t>امکان شخصی‌سازی قالب یا تم پنل خود را داشته باشد</w:t>
-      </w:r>
-      <w:r>
-        <w:rPr>
-          <w:rFonts w:cs="Mj_Casablanca Light"/>
-          <w:sz w:val="28"/>
-          <w:szCs w:val="28"/>
-          <w:lang w:bidi="fa-IR"/>
-        </w:rPr>
-        <w:t xml:space="preserve"> (Theme Customization).</w:t>
-      </w:r>
-    </w:p>
-    <w:p>
-      <w:pPr>
-        <w:rPr>
-          <w:rFonts w:cs="Mj_Casablanca Light"/>
-          <w:color w:val="2E74B5" w:themeColor="accent5" w:themeShade="BF"/>
-          <w:sz w:val="32"/>
-          <w:szCs w:val="32"/>
-          <w:rtl/>
-          <w:lang w:bidi="fa-IR"/>
-        </w:rPr>
-      </w:pPr>
-      <w:r>
-        <w:rPr>
-          <w:rFonts w:cs="Mj_Casablanca Light"/>
-          <w:color w:val="2E74B5" w:themeColor="accent5" w:themeShade="BF"/>
-          <w:sz w:val="32"/>
-          <w:szCs w:val="32"/>
-          <w:rtl/>
-          <w:lang w:bidi="fa-IR"/>
-        </w:rPr>
-        <w:br w:type="page"/>
-      </w:r>
-    </w:p>
-    <w:p>
-      <w:pPr>
-        <w:bidi/>
-        <w:rPr>
-          <w:rFonts w:cs="Mj_Casablanca Light"/>
-          <w:color w:val="00B0F0"/>
-          <w:sz w:val="36"/>
-          <w:szCs w:val="36"/>
-        </w:rPr>
-      </w:pPr>
-      <w:r>
-        <w:rPr>
-          <w:rFonts w:cs="Mj_Casablanca Light" w:hint="cs"/>
-          <w:b/>
-          <w:bCs/>
-          <w:color w:val="00B0F0"/>
-          <w:sz w:val="36"/>
-          <w:szCs w:val="36"/>
-          <w:rtl/>
-          <w:lang w:bidi="fa-IR"/>
-        </w:rPr>
-        <w:lastRenderedPageBreak/>
-        <w:t>۳. نیازمندی‌های کارمندان حضوری</w:t>
-      </w:r>
-    </w:p>
-    <w:p>
-      <w:pPr>
-        <w:bidi/>
-        <w:rPr>
-          <w:rFonts w:cs="Mj_Casablanca Light"/>
-          <w:sz w:val="32"/>
-          <w:szCs w:val="32"/>
-          <w:lang w:bidi="fa-IR"/>
-        </w:rPr>
-      </w:pPr>
-      <w:r>
-        <w:rPr>
-          <w:rFonts w:cs="Mj_Casablanca Light" w:hint="cs"/>
-          <w:sz w:val="32"/>
-          <w:szCs w:val="32"/>
-          <w:rtl/>
-          <w:lang w:bidi="fa-IR"/>
-        </w:rPr>
-        <w:t xml:space="preserve">کارمندان حضوری نیاز دارند که بتوانند </w:t>
-      </w:r>
-      <w:r>
-        <w:rPr>
-          <w:rFonts w:ascii="Arial" w:hAnsi="Arial" w:cs="Arial" w:hint="cs"/>
-          <w:sz w:val="32"/>
-          <w:szCs w:val="32"/>
-          <w:rtl/>
-          <w:lang w:bidi="fa-IR"/>
-        </w:rPr>
-        <w:t>…</w:t>
       </w:r>
     </w:p>
     <w:p>
@@ -1534,125 +1460,28 @@
           <w:bCs/>
           <w:sz w:val="28"/>
           <w:szCs w:val="28"/>
-          <w:rtl/>
-        </w:rPr>
-      </w:pPr>
-      <w:r>
-        <w:rPr>
-          <w:rFonts w:cs="Mj_Casablanca Light" w:hint="cs"/>
-          <w:b/>
-          <w:bCs/>
-          <w:sz w:val="28"/>
-          <w:szCs w:val="28"/>
-          <w:rtl/>
-        </w:rPr>
-        <w:t>وارد پنل کاربری خود شده و تقویم و لیست نوبت‌های همان روز را مشاهده کنند</w:t>
-      </w:r>
-      <w:r>
-        <w:rPr>
-          <w:rFonts w:cs="Mj_Casablanca Light" w:hint="cs"/>
-          <w:b/>
-          <w:bCs/>
-          <w:sz w:val="28"/>
-          <w:szCs w:val="28"/>
-          <w:rtl/>
-        </w:rPr>
-        <w:t xml:space="preserve"> تا بتواند خدمات رو به درستي و با رعايت نوبت داده شده ؛ ارائه كند. </w:t>
-      </w:r>
-      <w:r>
-        <w:rPr>
-          <w:rFonts w:cs="Mj_Casablanca Light"/>
-          <w:b/>
-          <w:bCs/>
-          <w:sz w:val="28"/>
-          <w:szCs w:val="28"/>
-          <w:rtl/>
-          <w:lang w:bidi="fa-IR"/>
-        </w:rPr>
-        <w:br w:type="page"/>
-      </w:r>
-    </w:p>
-    <w:p>
-      <w:pPr>
-        <w:bidi/>
-        <w:rPr>
-          <w:rFonts w:cs="Mj_Casablanca Light"/>
-          <w:b/>
-          <w:bCs/>
-          <w:color w:val="00B0F0"/>
-          <w:sz w:val="36"/>
-          <w:szCs w:val="36"/>
-          <w:rtl/>
-        </w:rPr>
-      </w:pPr>
-      <w:r>
-        <w:rPr>
-          <w:rFonts w:cs="Mj_Casablanca Light"/>
-          <w:b/>
-          <w:bCs/>
-          <w:color w:val="00B0F0"/>
-          <w:sz w:val="36"/>
-          <w:szCs w:val="36"/>
-          <w:rtl/>
-          <w:lang w:bidi="fa-IR"/>
-        </w:rPr>
-        <w:lastRenderedPageBreak/>
-        <w:t>۴</w:t>
-      </w:r>
-      <w:r>
-        <w:rPr>
-          <w:rFonts w:cs="Mj_Casablanca Light"/>
-          <w:b/>
-          <w:bCs/>
-          <w:color w:val="00B0F0"/>
-          <w:sz w:val="36"/>
-          <w:szCs w:val="36"/>
-          <w:lang w:bidi="fa-IR"/>
+        </w:rPr>
+      </w:pPr>
+      <w:r>
+        <w:rPr>
+          <w:rFonts w:cs="Mj_Casablanca Light"/>
+          <w:b/>
+          <w:bCs/>
+          <w:sz w:val="28"/>
+          <w:szCs w:val="28"/>
+          <w:rtl/>
+        </w:rPr>
+        <w:t>به مشتریانی که در فرآیند اخذ نوبت آنلاین دچار مشکل شده‌اند راهنمایی ارائه دهند</w:t>
+      </w:r>
+      <w:r>
+        <w:rPr>
+          <w:rFonts w:cs="Mj_Casablanca Light"/>
+          <w:b/>
+          <w:bCs/>
+          <w:sz w:val="28"/>
+          <w:szCs w:val="28"/>
         </w:rPr>
         <w:t xml:space="preserve">. </w:t>
-      </w:r>
-      <w:r>
-        <w:rPr>
-          <w:rFonts w:cs="Mj_Casablanca Light"/>
-          <w:b/>
-          <w:bCs/>
-          <w:color w:val="00B0F0"/>
-          <w:sz w:val="36"/>
-          <w:szCs w:val="36"/>
-          <w:rtl/>
-        </w:rPr>
-        <w:t>نیازمندی‌های کارمندان پشتیبانی بخش آنلاین</w:t>
-      </w:r>
-    </w:p>
-    <w:p>
-      <w:pPr>
-        <w:bidi/>
-        <w:rPr>
-          <w:rFonts w:cs="Mj_Casablanca Light"/>
-          <w:sz w:val="32"/>
-          <w:szCs w:val="32"/>
-          <w:lang w:bidi="fa-IR"/>
-        </w:rPr>
-      </w:pPr>
-      <w:r>
-        <w:rPr>
-          <w:rFonts w:cs="Mj_Casablanca Light" w:hint="cs"/>
-          <w:sz w:val="32"/>
-          <w:szCs w:val="32"/>
-          <w:rtl/>
-          <w:lang w:bidi="fa-IR"/>
-        </w:rPr>
-        <w:t xml:space="preserve">کارمندان پشتیبانی آنلاین نیاز دارند که بتوانند </w:t>
-      </w:r>
-      <w:r>
-        <w:rPr>
-          <w:rFonts w:ascii="Arial" w:hAnsi="Arial" w:cs="Arial" w:hint="cs"/>
-          <w:sz w:val="32"/>
-          <w:szCs w:val="32"/>
-          <w:rtl/>
-          <w:lang w:bidi="fa-IR"/>
-        </w:rPr>
-        <w:t>…</w:t>
       </w:r>
     </w:p>
     <w:p>
@@ -1680,17 +1509,17 @@
           <w:szCs w:val="28"/>
           <w:rtl/>
         </w:rPr>
-        <w:t>در پنل خود لیست پیام‌ها و چت‌های آنلاین مشتریان را مشاهده و به آن‌ها پاسخ دهند</w:t>
-      </w:r>
-      <w:r>
-        <w:rPr>
-          <w:rFonts w:cs="Mj_Casablanca Light"/>
-          <w:b/>
-          <w:bCs/>
-          <w:sz w:val="28"/>
-          <w:szCs w:val="28"/>
-        </w:rPr>
-        <w:t xml:space="preserve">. </w:t>
+        <w:t>نظرات ثبت شده کاربران را بررسی اولیه کرده و در صورت نیاز به مدیر ارجاع دهند</w:t>
+      </w:r>
+      <w:r>
+        <w:rPr>
+          <w:rFonts w:cs="Mj_Casablanca Light"/>
+          <w:b/>
+          <w:bCs/>
+          <w:sz w:val="28"/>
+          <w:szCs w:val="28"/>
+        </w:rPr>
+        <w:t>.</w:t>
       </w:r>
     </w:p>
     <w:p>
@@ -1707,28 +1536,19 @@
           <w:bCs/>
           <w:sz w:val="28"/>
           <w:szCs w:val="28"/>
-        </w:rPr>
-      </w:pPr>
-      <w:r>
-        <w:rPr>
-          <w:rFonts w:cs="Mj_Casablanca Light"/>
-          <w:b/>
-          <w:bCs/>
-          <w:sz w:val="28"/>
-          <w:szCs w:val="28"/>
-          <w:rtl/>
-        </w:rPr>
-        <w:t>اطلاعیه‌ها، اخبار و تبلیغات جدید کسب‌وکار را در صفحه اختصاصی سایت منتشر کنند</w:t>
-      </w:r>
-      <w:r>
-        <w:rPr>
-          <w:rFonts w:cs="Mj_Casablanca Light"/>
-          <w:b/>
-          <w:bCs/>
-          <w:sz w:val="28"/>
-          <w:szCs w:val="28"/>
-        </w:rPr>
-        <w:t xml:space="preserve">. </w:t>
+          <w:rtl/>
+        </w:rPr>
+      </w:pPr>
+      <w:r>
+        <w:rPr>
+          <w:rFonts w:cs="Mj_Casablanca Light" w:hint="cs"/>
+          <w:b/>
+          <w:bCs/>
+          <w:sz w:val="28"/>
+          <w:szCs w:val="28"/>
+          <w:rtl/>
+        </w:rPr>
+        <w:t>برای مشتریانی که به صورت حضوری یا تلفنی مراجعه می‌کنند، نوبت جدید در سیستم ثبت کنند.</w:t>
       </w:r>
     </w:p>
     <w:p>
@@ -1745,28 +1565,19 @@
           <w:bCs/>
           <w:sz w:val="28"/>
           <w:szCs w:val="28"/>
-        </w:rPr>
-      </w:pPr>
-      <w:r>
-        <w:rPr>
-          <w:rFonts w:cs="Mj_Casablanca Light"/>
-          <w:b/>
-          <w:bCs/>
-          <w:sz w:val="28"/>
-          <w:szCs w:val="28"/>
-          <w:rtl/>
-        </w:rPr>
-        <w:t>اطلاعات پروفایل کسب‌وکار (مثل ساعات کاری یا راه‌های ارتباطی) را در صورت نیاز به‌روزرسانی کنند</w:t>
-      </w:r>
-      <w:r>
-        <w:rPr>
-          <w:rFonts w:cs="Mj_Casablanca Light"/>
-          <w:b/>
-          <w:bCs/>
-          <w:sz w:val="28"/>
-          <w:szCs w:val="28"/>
-        </w:rPr>
-        <w:t xml:space="preserve">. </w:t>
+          <w:rtl/>
+        </w:rPr>
+      </w:pPr>
+      <w:r>
+        <w:rPr>
+          <w:rFonts w:cs="Mj_Casablanca Light" w:hint="cs"/>
+          <w:b/>
+          <w:bCs/>
+          <w:sz w:val="28"/>
+          <w:szCs w:val="28"/>
+          <w:rtl/>
+        </w:rPr>
+        <w:t>وضعیت نوبت مشتریان را تغییر دهند (مثلاً: حضور یافت، لغو شد، انجام شد).</w:t>
       </w:r>
     </w:p>
     <w:p>
@@ -1783,28 +1594,172 @@
           <w:bCs/>
           <w:sz w:val="28"/>
           <w:szCs w:val="28"/>
-        </w:rPr>
-      </w:pPr>
-      <w:r>
-        <w:rPr>
-          <w:rFonts w:cs="Mj_Casablanca Light"/>
-          <w:b/>
-          <w:bCs/>
-          <w:sz w:val="28"/>
-          <w:szCs w:val="28"/>
-          <w:rtl/>
-        </w:rPr>
-        <w:t>به مشتریانی که در فرآیند اخذ نوبت آنلاین دچار مشکل شده‌اند راهنمایی ارائه دهند</w:t>
-      </w:r>
-      <w:r>
-        <w:rPr>
-          <w:rFonts w:cs="Mj_Casablanca Light"/>
-          <w:b/>
-          <w:bCs/>
-          <w:sz w:val="28"/>
-          <w:szCs w:val="28"/>
+          <w:rtl/>
+        </w:rPr>
+      </w:pPr>
+      <w:r>
+        <w:rPr>
+          <w:rFonts w:cs="Mj_Casablanca Light" w:hint="cs"/>
+          <w:b/>
+          <w:bCs/>
+          <w:sz w:val="28"/>
+          <w:szCs w:val="28"/>
+          <w:rtl/>
+        </w:rPr>
+        <w:t>با مشتریانی که نوبت دارند برای هماهنگی‌های لازم تماس بگیرند (دسترسی به اطلاعات تماس نوبت‌ها).</w:t>
+      </w:r>
+      <w:r>
+        <w:rPr>
+          <w:rFonts w:cs="Mj_Casablanca Light"/>
+          <w:b/>
+          <w:bCs/>
+          <w:sz w:val="28"/>
+          <w:szCs w:val="28"/>
+          <w:rtl/>
+        </w:rPr>
+        <w:br w:type="page"/>
+      </w:r>
+    </w:p>
+    <w:p>
+      <w:pPr>
+        <w:bidi/>
+        <w:rPr>
+          <w:rFonts w:cs="Mj_Casablanca Light"/>
+          <w:b/>
+          <w:bCs/>
+          <w:color w:val="00B0F0"/>
+          <w:sz w:val="36"/>
+          <w:szCs w:val="36"/>
+          <w:rtl/>
+          <w:lang w:bidi="fa-IR"/>
+        </w:rPr>
+      </w:pPr>
+      <w:r>
+        <w:rPr>
+          <w:rFonts w:cs="Mj_Casablanca Light" w:hint="cs"/>
+          <w:b/>
+          <w:bCs/>
+          <w:color w:val="00B0F0"/>
+          <w:sz w:val="36"/>
+          <w:szCs w:val="36"/>
+          <w:rtl/>
+          <w:lang w:bidi="fa-IR"/>
+        </w:rPr>
+        <w:lastRenderedPageBreak/>
+        <w:t>5</w:t>
+      </w:r>
+      <w:r>
+        <w:rPr>
+          <w:rFonts w:cs="Mj_Casablanca Light"/>
+          <w:b/>
+          <w:bCs/>
+          <w:color w:val="00B0F0"/>
+          <w:sz w:val="36"/>
+          <w:szCs w:val="36"/>
+          <w:lang w:bidi="fa-IR"/>
         </w:rPr>
         <w:t xml:space="preserve">. </w:t>
+      </w:r>
+      <w:r>
+        <w:rPr>
+          <w:rFonts w:cs="Mj_Casablanca Light"/>
+          <w:b/>
+          <w:bCs/>
+          <w:color w:val="00B0F0"/>
+          <w:sz w:val="36"/>
+          <w:szCs w:val="36"/>
+          <w:rtl/>
+          <w:lang w:bidi="fa-IR"/>
+        </w:rPr>
+        <w:t>نیازمندی‌های مدیران کل پلتفرم</w:t>
+      </w:r>
+      <w:r>
+        <w:rPr>
+          <w:rFonts w:cs="Mj_Casablanca Light" w:hint="cs"/>
+          <w:b/>
+          <w:bCs/>
+          <w:color w:val="00B0F0"/>
+          <w:sz w:val="36"/>
+          <w:szCs w:val="36"/>
+          <w:rtl/>
+          <w:lang w:bidi="fa-IR"/>
+        </w:rPr>
+        <w:t xml:space="preserve"> </w:t>
+      </w:r>
+      <w:r>
+        <w:rPr>
+          <w:rFonts w:cs="Mj_Casablanca Light"/>
+          <w:b/>
+          <w:bCs/>
+          <w:color w:val="00B0F0"/>
+          <w:sz w:val="36"/>
+          <w:szCs w:val="36"/>
+          <w:lang w:bidi="fa-IR"/>
+        </w:rPr>
+        <w:t>(Super Admin)</w:t>
+      </w:r>
+    </w:p>
+    <w:p>
+      <w:pPr>
+        <w:pStyle w:val="ListParagraph"/>
+        <w:bidi/>
+        <w:ind w:left="0"/>
+        <w:rPr>
+          <w:rFonts w:cs="Mj_Casablanca Light"/>
+          <w:sz w:val="32"/>
+          <w:szCs w:val="32"/>
+          <w:lang w:bidi="fa-IR"/>
+        </w:rPr>
+      </w:pPr>
+      <w:r>
+        <w:rPr>
+          <w:rFonts w:cs="Mj_Casablanca Light" w:hint="cs"/>
+          <w:sz w:val="32"/>
+          <w:szCs w:val="32"/>
+          <w:rtl/>
+          <w:lang w:bidi="fa-IR"/>
+        </w:rPr>
+        <w:t xml:space="preserve">مدیران </w:t>
+      </w:r>
+      <w:r>
+        <w:rPr>
+          <w:rFonts w:cs="Mj_Casablanca Light" w:hint="cs"/>
+          <w:sz w:val="32"/>
+          <w:szCs w:val="32"/>
+          <w:rtl/>
+          <w:lang w:bidi="fa-IR"/>
+        </w:rPr>
+        <w:t>كل پلتفرم</w:t>
+      </w:r>
+      <w:r>
+        <w:rPr>
+          <w:rFonts w:cs="Mj_Casablanca Light" w:hint="cs"/>
+          <w:sz w:val="32"/>
+          <w:szCs w:val="32"/>
+          <w:rtl/>
+          <w:lang w:bidi="fa-IR"/>
+        </w:rPr>
+        <w:t xml:space="preserve"> (بخش پشتيباني اصلي سايت)</w:t>
+      </w:r>
+      <w:r>
+        <w:rPr>
+          <w:rFonts w:cs="Mj_Casablanca Light" w:hint="cs"/>
+          <w:sz w:val="32"/>
+          <w:szCs w:val="32"/>
+          <w:rtl/>
+          <w:lang w:bidi="fa-IR"/>
+        </w:rPr>
+        <w:t xml:space="preserve"> سایت نیاز دارند که بتوانند</w:t>
+      </w:r>
+      <w:r>
+        <w:rPr>
+          <w:rFonts w:ascii="Arial" w:hAnsi="Arial" w:cs="Arial" w:hint="cs"/>
+          <w:sz w:val="32"/>
+          <w:szCs w:val="32"/>
+          <w:rtl/>
+          <w:lang w:bidi="fa-IR"/>
+        </w:rPr>
+        <w:t>…</w:t>
       </w:r>
     </w:p>
     <w:p>
@@ -1821,28 +1776,40 @@
           <w:bCs/>
           <w:sz w:val="28"/>
           <w:szCs w:val="28"/>
-        </w:rPr>
-      </w:pPr>
-      <w:r>
-        <w:rPr>
-          <w:rFonts w:cs="Mj_Casablanca Light"/>
-          <w:b/>
-          <w:bCs/>
-          <w:sz w:val="28"/>
-          <w:szCs w:val="28"/>
-          <w:rtl/>
-        </w:rPr>
-        <w:t>نظرات ثبت شده کاربران را بررسی اولیه کرده و در صورت نیاز به مدیر ارجاع دهند</w:t>
-      </w:r>
-      <w:r>
-        <w:rPr>
-          <w:rFonts w:cs="Mj_Casablanca Light"/>
-          <w:b/>
-          <w:bCs/>
-          <w:sz w:val="28"/>
-          <w:szCs w:val="28"/>
-        </w:rPr>
-        <w:t>.</w:t>
+          <w:rtl/>
+        </w:rPr>
+      </w:pPr>
+      <w:r>
+        <w:rPr>
+          <w:rFonts w:cs="Mj_Casablanca Light" w:hint="cs"/>
+          <w:b/>
+          <w:bCs/>
+          <w:sz w:val="28"/>
+          <w:szCs w:val="28"/>
+          <w:rtl/>
+        </w:rPr>
+        <w:t>از طریق پنل مدیریت (</w:t>
+      </w:r>
+      <w:r>
+        <w:rPr>
+          <w:rFonts w:cs="Mj_Casablanca Light" w:hint="cs"/>
+          <w:b/>
+          <w:bCs/>
+          <w:sz w:val="28"/>
+          <w:szCs w:val="28"/>
+        </w:rPr>
+        <w:t>Admin Panel</w:t>
+      </w:r>
+      <w:r>
+        <w:rPr>
+          <w:rFonts w:cs="Mj_Casablanca Light" w:hint="cs"/>
+          <w:b/>
+          <w:bCs/>
+          <w:sz w:val="28"/>
+          <w:szCs w:val="28"/>
+          <w:rtl/>
+        </w:rPr>
+        <w:t>) به تمامی کاربران، مدیران کسب‌وکارها و کارمندان پشتیبانی خدمات و راهنمایی ارائه دهند.</w:t>
       </w:r>
     </w:p>
     <w:p>
@@ -1854,6 +1821,16 @@
         </w:numPr>
         <w:bidi/>
         <w:rPr>
+          <w:rFonts w:cs="Mj_Casablanca Light"/>
+          <w:b/>
+          <w:bCs/>
+          <w:sz w:val="28"/>
+          <w:szCs w:val="28"/>
+          <w:rtl/>
+        </w:rPr>
+      </w:pPr>
+      <w:r>
+        <w:rPr>
           <w:rFonts w:cs="Mj_Casablanca Light" w:hint="cs"/>
           <w:b/>
           <w:bCs/>
@@ -1861,7 +1838,8 @@
           <w:szCs w:val="28"/>
           <w:rtl/>
         </w:rPr>
-      </w:pPr>
+        <w:t>کسب‌وکارهای برتر و معروف (</w:t>
+      </w:r>
       <w:r>
         <w:rPr>
           <w:rFonts w:cs="Mj_Casablanca Light" w:hint="cs"/>
@@ -1869,9 +1847,19 @@
           <w:bCs/>
           <w:sz w:val="28"/>
           <w:szCs w:val="28"/>
-          <w:rtl/>
-        </w:rPr>
-        <w:t>برای مشتریانی که به صورت حضوری یا تلفنی مراجعه می‌کنند، نوبت جدید در سیستم ثبت کنند.</w:t>
+        </w:rPr>
+        <w:t>Famous businesses</w:t>
+      </w:r>
+      <w:r>
+        <w:rPr>
+          <w:rFonts w:cs="Mj_Casablanca Light" w:hint="cs"/>
+          <w:b/>
+          <w:bCs/>
+          <w:sz w:val="28"/>
+          <w:szCs w:val="28"/>
+          <w:rtl/>
+        </w:rPr>
+        <w:t>) را در صفحه اصلی سایت نمایش دهند.</w:t>
       </w:r>
     </w:p>
     <w:p>
@@ -1883,458 +1871,7 @@
         </w:numPr>
         <w:bidi/>
         <w:rPr>
-          <w:rFonts w:cs="Mj_Casablanca Light" w:hint="cs"/>
-          <w:b/>
-          <w:bCs/>
-          <w:sz w:val="28"/>
-          <w:szCs w:val="28"/>
-          <w:rtl/>
-        </w:rPr>
-      </w:pPr>
-      <w:r>
-        <w:rPr>
-          <w:rFonts w:cs="Mj_Casablanca Light" w:hint="cs"/>
-          <w:b/>
-          <w:bCs/>
-          <w:sz w:val="28"/>
-          <w:szCs w:val="28"/>
-          <w:rtl/>
-        </w:rPr>
-        <w:t>وضعیت نوبت مشتریان را تغییر دهند (مثلاً: حضور یافت، لغو شد، انجام شد).</w:t>
-      </w:r>
-    </w:p>
-    <w:p>
-      <w:pPr>
-        <w:pStyle w:val="ListParagraph"/>
-        <w:numPr>
-          <w:ilvl w:val="0"/>
-          <w:numId w:val="8"/>
-        </w:numPr>
-        <w:bidi/>
-        <w:rPr>
-          <w:rFonts w:cs="Mj_Casablanca Light" w:hint="cs"/>
-          <w:b/>
-          <w:bCs/>
-          <w:sz w:val="28"/>
-          <w:szCs w:val="28"/>
-          <w:rtl/>
-        </w:rPr>
-      </w:pPr>
-      <w:r>
-        <w:rPr>
-          <w:rFonts w:cs="Mj_Casablanca Light" w:hint="cs"/>
-          <w:b/>
-          <w:bCs/>
-          <w:sz w:val="28"/>
-          <w:szCs w:val="28"/>
-          <w:rtl/>
-        </w:rPr>
-        <w:t>با مشتریانی که نوبت دارند برای هماهنگی‌های لازم تماس بگیرند (دسترسی به اطلاعات تماس نوبت‌ها).</w:t>
-      </w:r>
-    </w:p>
-    <w:p>
-      <w:pPr>
-        <w:pStyle w:val="ListParagraph"/>
-        <w:numPr>
-          <w:ilvl w:val="0"/>
-          <w:numId w:val="8"/>
-        </w:numPr>
-        <w:bidi/>
-        <w:rPr>
-          <w:rFonts w:cs="Mj_Casablanca Light"/>
-          <w:b/>
-          <w:bCs/>
-          <w:sz w:val="28"/>
-          <w:szCs w:val="28"/>
-        </w:rPr>
-      </w:pPr>
-      <w:r>
-        <w:rPr>
-          <w:rFonts w:cs="Mj_Casablanca Light" w:hint="cs"/>
-          <w:b/>
-          <w:bCs/>
-          <w:sz w:val="28"/>
-          <w:szCs w:val="28"/>
-          <w:rtl/>
-        </w:rPr>
-        <w:t>تداخل‌های زمانی در نوبت‌دهی را در سیستم مشاهده و مدیریت کنند.</w:t>
-      </w:r>
-    </w:p>
-    <w:p>
-      <w:pPr>
-        <w:rPr>
-          <w:rFonts w:cs="Mj_Casablanca Light"/>
-          <w:b/>
-          <w:bCs/>
-          <w:sz w:val="28"/>
-          <w:szCs w:val="28"/>
-          <w:rtl/>
-        </w:rPr>
-      </w:pPr>
-      <w:r>
-        <w:rPr>
-          <w:rFonts w:cs="Mj_Casablanca Light"/>
-          <w:b/>
-          <w:bCs/>
-          <w:sz w:val="28"/>
-          <w:szCs w:val="28"/>
-          <w:rtl/>
-        </w:rPr>
-        <w:br w:type="page"/>
-      </w:r>
-    </w:p>
-    <w:p>
-      <w:pPr>
-        <w:bidi/>
-        <w:rPr>
-          <w:rFonts w:cs="Mj_Casablanca Light"/>
-          <w:b/>
-          <w:bCs/>
-          <w:color w:val="00B0F0"/>
-          <w:sz w:val="36"/>
-          <w:szCs w:val="36"/>
-          <w:rtl/>
-          <w:lang w:bidi="fa-IR"/>
-        </w:rPr>
-      </w:pPr>
-      <w:r>
-        <w:rPr>
-          <w:rFonts w:cs="Mj_Casablanca Light" w:hint="cs"/>
-          <w:b/>
-          <w:bCs/>
-          <w:color w:val="00B0F0"/>
-          <w:sz w:val="36"/>
-          <w:szCs w:val="36"/>
-          <w:rtl/>
-          <w:lang w:bidi="fa-IR"/>
-        </w:rPr>
-        <w:lastRenderedPageBreak/>
-        <w:t>5</w:t>
-      </w:r>
-      <w:r>
-        <w:rPr>
-          <w:rFonts w:cs="Mj_Casablanca Light"/>
-          <w:b/>
-          <w:bCs/>
-          <w:color w:val="00B0F0"/>
-          <w:sz w:val="36"/>
-          <w:szCs w:val="36"/>
-          <w:lang w:bidi="fa-IR"/>
-        </w:rPr>
-        <w:t xml:space="preserve">. </w:t>
-      </w:r>
-      <w:r>
-        <w:rPr>
-          <w:rFonts w:cs="Mj_Casablanca Light"/>
-          <w:b/>
-          <w:bCs/>
-          <w:color w:val="00B0F0"/>
-          <w:sz w:val="36"/>
-          <w:szCs w:val="36"/>
-          <w:rtl/>
-          <w:lang w:bidi="fa-IR"/>
-        </w:rPr>
-        <w:t>نیازمندی‌های مدیران کل پلتفرم</w:t>
-      </w:r>
-      <w:r>
-        <w:rPr>
-          <w:rFonts w:cs="Mj_Casablanca Light" w:hint="cs"/>
-          <w:b/>
-          <w:bCs/>
-          <w:color w:val="00B0F0"/>
-          <w:sz w:val="36"/>
-          <w:szCs w:val="36"/>
-          <w:rtl/>
-          <w:lang w:bidi="fa-IR"/>
-        </w:rPr>
-        <w:t xml:space="preserve"> </w:t>
-      </w:r>
-      <w:r>
-        <w:rPr>
-          <w:rFonts w:cs="Mj_Casablanca Light"/>
-          <w:b/>
-          <w:bCs/>
-          <w:color w:val="00B0F0"/>
-          <w:sz w:val="36"/>
-          <w:szCs w:val="36"/>
-          <w:lang w:bidi="fa-IR"/>
-        </w:rPr>
-        <w:t>(Super Admin)</w:t>
-      </w:r>
-    </w:p>
-    <w:p>
-      <w:pPr>
-        <w:pStyle w:val="ListParagraph"/>
-        <w:bidi/>
-        <w:ind w:left="0"/>
-        <w:rPr>
-          <w:rFonts w:cs="Mj_Casablanca Light"/>
-          <w:sz w:val="32"/>
-          <w:szCs w:val="32"/>
-          <w:lang w:bidi="fa-IR"/>
-        </w:rPr>
-      </w:pPr>
-      <w:r>
-        <w:rPr>
-          <w:rFonts w:cs="Mj_Casablanca Light" w:hint="cs"/>
-          <w:sz w:val="32"/>
-          <w:szCs w:val="32"/>
-          <w:rtl/>
-          <w:lang w:bidi="fa-IR"/>
-        </w:rPr>
-        <w:t xml:space="preserve">مدیران </w:t>
-      </w:r>
-      <w:r>
-        <w:rPr>
-          <w:rFonts w:cs="Mj_Casablanca Light" w:hint="cs"/>
-          <w:sz w:val="32"/>
-          <w:szCs w:val="32"/>
-          <w:rtl/>
-          <w:lang w:bidi="fa-IR"/>
-        </w:rPr>
-        <w:t>كل پلتفرم</w:t>
-      </w:r>
-      <w:r>
-        <w:rPr>
-          <w:rFonts w:cs="Mj_Casablanca Light" w:hint="cs"/>
-          <w:sz w:val="32"/>
-          <w:szCs w:val="32"/>
-          <w:rtl/>
-          <w:lang w:bidi="fa-IR"/>
-        </w:rPr>
-        <w:t xml:space="preserve"> (بخش پشتيباني اصلي سايت)</w:t>
-      </w:r>
-      <w:r>
-        <w:rPr>
-          <w:rFonts w:cs="Mj_Casablanca Light" w:hint="cs"/>
-          <w:sz w:val="32"/>
-          <w:szCs w:val="32"/>
-          <w:rtl/>
-          <w:lang w:bidi="fa-IR"/>
-        </w:rPr>
-        <w:t xml:space="preserve"> سایت نیاز دارند که بتوانند</w:t>
-      </w:r>
-      <w:r>
-        <w:rPr>
-          <w:rFonts w:ascii="Arial" w:hAnsi="Arial" w:cs="Arial" w:hint="cs"/>
-          <w:sz w:val="32"/>
-          <w:szCs w:val="32"/>
-          <w:rtl/>
-          <w:lang w:bidi="fa-IR"/>
-        </w:rPr>
-        <w:t>…</w:t>
-      </w:r>
-    </w:p>
-    <w:p>
-      <w:pPr>
-        <w:pStyle w:val="ListParagraph"/>
-        <w:numPr>
-          <w:ilvl w:val="0"/>
-          <w:numId w:val="8"/>
-        </w:numPr>
-        <w:bidi/>
-        <w:rPr>
-          <w:rFonts w:cs="Mj_Casablanca Light" w:hint="cs"/>
-          <w:b/>
-          <w:bCs/>
-          <w:sz w:val="28"/>
-          <w:szCs w:val="28"/>
-          <w:rtl/>
-        </w:rPr>
-      </w:pPr>
-      <w:r>
-        <w:rPr>
-          <w:rFonts w:cs="Mj_Casablanca Light" w:hint="cs"/>
-          <w:b/>
-          <w:bCs/>
-          <w:sz w:val="28"/>
-          <w:szCs w:val="28"/>
-          <w:rtl/>
-        </w:rPr>
-        <w:t>از طریق پنل مدیریت (</w:t>
-      </w:r>
-      <w:r>
-        <w:rPr>
-          <w:rFonts w:cs="Mj_Casablanca Light" w:hint="cs"/>
-          <w:b/>
-          <w:bCs/>
-          <w:sz w:val="28"/>
-          <w:szCs w:val="28"/>
-        </w:rPr>
-        <w:t>Admin Panel</w:t>
-      </w:r>
-      <w:r>
-        <w:rPr>
-          <w:rFonts w:cs="Mj_Casablanca Light" w:hint="cs"/>
-          <w:b/>
-          <w:bCs/>
-          <w:sz w:val="28"/>
-          <w:szCs w:val="28"/>
-          <w:rtl/>
-        </w:rPr>
-        <w:t>) به تمامی کاربران، مدیران کسب‌وکارها و کارمندان پشتیبانی خدمات و راهنمایی ارائه دهند.</w:t>
-      </w:r>
-    </w:p>
-    <w:p>
-      <w:pPr>
-        <w:pStyle w:val="ListParagraph"/>
-        <w:numPr>
-          <w:ilvl w:val="0"/>
-          <w:numId w:val="8"/>
-        </w:numPr>
-        <w:bidi/>
-        <w:rPr>
-          <w:rFonts w:cs="Mj_Casablanca Light" w:hint="cs"/>
-          <w:b/>
-          <w:bCs/>
-          <w:sz w:val="28"/>
-          <w:szCs w:val="28"/>
-          <w:rtl/>
-        </w:rPr>
-      </w:pPr>
-      <w:r>
-        <w:rPr>
-          <w:rFonts w:cs="Mj_Casablanca Light" w:hint="cs"/>
-          <w:b/>
-          <w:bCs/>
-          <w:sz w:val="28"/>
-          <w:szCs w:val="28"/>
-          <w:rtl/>
-        </w:rPr>
-        <w:t>کسب‌وکارهای برتر و معروف (</w:t>
-      </w:r>
-      <w:r>
-        <w:rPr>
-          <w:rFonts w:cs="Mj_Casablanca Light" w:hint="cs"/>
-          <w:b/>
-          <w:bCs/>
-          <w:sz w:val="28"/>
-          <w:szCs w:val="28"/>
-        </w:rPr>
-        <w:t>Famous businesses</w:t>
-      </w:r>
-      <w:r>
-        <w:rPr>
-          <w:rFonts w:cs="Mj_Casablanca Light" w:hint="cs"/>
-          <w:b/>
-          <w:bCs/>
-          <w:sz w:val="28"/>
-          <w:szCs w:val="28"/>
-          <w:rtl/>
-        </w:rPr>
-        <w:t>) را در صفحه اصلی سایت نمایش دهند.</w:t>
-      </w:r>
-    </w:p>
-    <w:p>
-      <w:pPr>
-        <w:pStyle w:val="ListParagraph"/>
-        <w:numPr>
-          <w:ilvl w:val="0"/>
-          <w:numId w:val="8"/>
-        </w:numPr>
-        <w:bidi/>
-        <w:rPr>
-          <w:rFonts w:cs="Mj_Casablanca Light" w:hint="cs"/>
-          <w:b/>
-          <w:bCs/>
-          <w:sz w:val="28"/>
-          <w:szCs w:val="28"/>
-          <w:rtl/>
-        </w:rPr>
-      </w:pPr>
-      <w:r>
-        <w:rPr>
-          <w:rFonts w:cs="Mj_Casablanca Light" w:hint="cs"/>
-          <w:b/>
-          <w:bCs/>
-          <w:sz w:val="28"/>
-          <w:szCs w:val="28"/>
-          <w:rtl/>
-        </w:rPr>
-        <w:t xml:space="preserve">فضاهای تبلیغاتی سایت (مثل صفحه اصلی یا نتایج جستجو) را مدیریت کرده و به کسب‌وکارها اختصاص دهند (بخش </w:t>
-      </w:r>
-      <w:r>
-        <w:rPr>
-          <w:rFonts w:cs="Mj_Casablanca Light" w:hint="cs"/>
-          <w:b/>
-          <w:bCs/>
-          <w:sz w:val="28"/>
-          <w:szCs w:val="28"/>
-        </w:rPr>
-        <w:t>Advertising</w:t>
-      </w:r>
-      <w:r>
-        <w:rPr>
-          <w:rFonts w:cs="Mj_Casablanca Light" w:hint="cs"/>
-          <w:b/>
-          <w:bCs/>
-          <w:sz w:val="28"/>
-          <w:szCs w:val="28"/>
-          <w:rtl/>
-        </w:rPr>
-        <w:t>).</w:t>
-      </w:r>
-    </w:p>
-    <w:p>
-      <w:pPr>
-        <w:pStyle w:val="ListParagraph"/>
-        <w:numPr>
-          <w:ilvl w:val="0"/>
-          <w:numId w:val="8"/>
-        </w:numPr>
-        <w:bidi/>
-        <w:rPr>
-          <w:rFonts w:cs="Mj_Casablanca Light" w:hint="cs"/>
-          <w:b/>
-          <w:bCs/>
-          <w:sz w:val="28"/>
-          <w:szCs w:val="28"/>
-          <w:rtl/>
-        </w:rPr>
-      </w:pPr>
-      <w:r>
-        <w:rPr>
-          <w:rFonts w:cs="Mj_Casablanca Light" w:hint="cs"/>
-          <w:b/>
-          <w:bCs/>
-          <w:sz w:val="28"/>
-          <w:szCs w:val="28"/>
-          <w:rtl/>
-        </w:rPr>
-        <w:t xml:space="preserve">درصد کمیسیون‌های دریافتی از هر تراکنش موفق نوبت‌دهی را سیستماتیک مدیریت و مشاهده کنند (بخش </w:t>
-      </w:r>
-      <w:r>
-        <w:rPr>
-          <w:rFonts w:cs="Mj_Casablanca Light" w:hint="cs"/>
-          <w:b/>
-          <w:bCs/>
-          <w:sz w:val="28"/>
-          <w:szCs w:val="28"/>
-        </w:rPr>
-        <w:t>Commissions</w:t>
-      </w:r>
-      <w:r>
-        <w:rPr>
-          <w:rFonts w:cs="Mj_Casablanca Light" w:hint="cs"/>
-          <w:b/>
-          <w:bCs/>
-          <w:sz w:val="28"/>
-          <w:szCs w:val="28"/>
-          <w:rtl/>
-        </w:rPr>
-        <w:t>).</w:t>
-      </w:r>
-    </w:p>
-    <w:p>
-      <w:pPr>
-        <w:pStyle w:val="ListParagraph"/>
-        <w:numPr>
-          <w:ilvl w:val="0"/>
-          <w:numId w:val="8"/>
-        </w:numPr>
-        <w:bidi/>
-        <w:rPr>
-          <w:rFonts w:cs="Mj_Casablanca Light" w:hint="cs"/>
+          <w:rFonts w:cs="Mj_Casablanca Light"/>
           <w:b/>
           <w:bCs/>
           <w:sz w:val="28"/>
@@ -2422,7 +1959,7 @@
         <v:path o:extrusionok="f" gradientshapeok="t" o:connecttype="rect"/>
         <o:lock v:ext="edit" aspectratio="t"/>
       </v:shapetype>
-      <v:shape id="_x0000_i1025" type="#_x0000_t75" style="width:11.5pt;height:11.5pt" o:bullet="t">
+      <v:shape id="_x0000_i1025" type="#_x0000_t75" style="width:11.25pt;height:11.25pt" o:bullet="t">
         <v:imagedata r:id="rId1" o:title="mso3BF"/>
       </v:shape>
     </w:pict>
@@ -4408,6 +3945,7 @@
   <w:style w:type="character" w:default="1" w:styleId="DefaultParagraphFont">
     <w:name w:val="Default Paragraph Font"/>
     <w:uiPriority w:val="1"/>
+    <w:semiHidden/>
     <w:unhideWhenUsed/>
   </w:style>
   <w:style w:type="table" w:default="1" w:styleId="TableNormal">

</xml_diff>

<commit_message>
Update BusinessRequirements; Update Functional-NonFunctional Requirement; Update UserRequirements; Add Concept Version; Update Task Info WBS-12
</commit_message>
<xml_diff>
--- a/Documentation/Analysis/Requirements Analysis/BusinessRequirements - W.docx
+++ b/Documentation/Analysis/Requirements Analysis/BusinessRequirements - W.docx
@@ -277,7 +277,7 @@
           <w:szCs w:val="28"/>
           <w:rtl/>
         </w:rPr>
-        <w:t>عملکرد و فعالیت کارمندان خود را در سیستم رصد کند</w:t>
+        <w:t>لیست کامل نوبت‌های ثبت‌شده (آنلاین و حضوری) را مشاهده و مدیریت کند</w:t>
       </w:r>
       <w:r>
         <w:rPr>
@@ -317,7 +317,19 @@
           <w:szCs w:val="28"/>
           <w:rtl/>
         </w:rPr>
-        <w:t>لیست کامل نوبت‌های ثبت‌شده (آنلاین و حضوری) را مشاهده و مدیریت کند</w:t>
+        <w:t>امتیازات کاربران را</w:t>
+      </w:r>
+      <w:r>
+        <w:rPr>
+          <w:rFonts w:cs="Mj_Casablanca Light" w:hint="cs"/>
+          <w:b/>
+          <w:bCs/>
+          <w:sz w:val="28"/>
+          <w:szCs w:val="28"/>
+          <w:rtl/>
+          <w:lang w:bidi="fa-IR"/>
+        </w:rPr>
+        <w:t xml:space="preserve"> ببيند</w:t>
       </w:r>
       <w:r>
         <w:rPr>
@@ -357,7 +369,7 @@
           <w:szCs w:val="28"/>
           <w:rtl/>
         </w:rPr>
-        <w:t>نظرات و امتیازات کاربران را بخواند، به آن‌ها پاسخ دهد و مشکلات را پیگیری کند</w:t>
+        <w:t>آمار دقیق مشتریان ماهانه، میزان رزروها را مشاهده کند</w:t>
       </w:r>
       <w:r>
         <w:rPr>
@@ -397,7 +409,7 @@
           <w:szCs w:val="28"/>
           <w:rtl/>
         </w:rPr>
-        <w:t>آمار دقیق مشتریان ماهانه، میزان رزروها را مشاهده کند</w:t>
+        <w:t>بر تبلیغات و اطلاعیه‌هایی که بخش پشتیبانی در صفحه کسب‌وکار قرار می‌دهد نظارت کند</w:t>
       </w:r>
       <w:r>
         <w:rPr>
@@ -437,7 +449,29 @@
           <w:szCs w:val="28"/>
           <w:rtl/>
         </w:rPr>
-        <w:t>بر تبلیغات و اطلاعیه‌هایی که بخش پشتیبانی در صفحه کسب‌وکار قرار می‌دهد نظارت کند</w:t>
+        <w:t>در داشبورد خود، علاوه بر نوبت‌ها، بتواند وظایف</w:t>
+      </w:r>
+      <w:r>
+        <w:rPr>
+          <w:rFonts w:cs="Mj_Casablanca Light"/>
+          <w:b/>
+          <w:bCs/>
+          <w:sz w:val="28"/>
+          <w:szCs w:val="28"/>
+          <w:lang w:bidi="fa-IR"/>
+        </w:rPr>
+        <w:t xml:space="preserve"> (Tasks) </w:t>
+      </w:r>
+      <w:r>
+        <w:rPr>
+          <w:rFonts w:cs="Mj_Casablanca Light"/>
+          <w:b/>
+          <w:bCs/>
+          <w:sz w:val="28"/>
+          <w:szCs w:val="28"/>
+          <w:rtl/>
+        </w:rPr>
+        <w:t>و محتواهای تولید شده توسط کارمندانش را مدیریت کند</w:t>
       </w:r>
       <w:r>
         <w:rPr>
@@ -477,40 +511,755 @@
           <w:szCs w:val="28"/>
           <w:rtl/>
         </w:rPr>
-        <w:t>در داشبورد خود، علاوه بر نوبت‌ها، بتواند وظایف</w:t>
-      </w:r>
-      <w:r>
-        <w:rPr>
-          <w:rFonts w:cs="Mj_Casablanca Light"/>
-          <w:b/>
-          <w:bCs/>
-          <w:sz w:val="28"/>
-          <w:szCs w:val="28"/>
-          <w:lang w:bidi="fa-IR"/>
-        </w:rPr>
-        <w:t xml:space="preserve"> (Tasks) </w:t>
-      </w:r>
-      <w:r>
-        <w:rPr>
-          <w:rFonts w:cs="Mj_Casablanca Light"/>
-          <w:b/>
-          <w:bCs/>
-          <w:sz w:val="28"/>
-          <w:szCs w:val="28"/>
-          <w:rtl/>
-        </w:rPr>
-        <w:t>و محتواهای تولید شده توسط کارمندانش را مدیریت کند</w:t>
-      </w:r>
-      <w:r>
-        <w:rPr>
-          <w:rFonts w:cs="Mj_Casablanca Light"/>
-          <w:b/>
-          <w:bCs/>
-          <w:sz w:val="28"/>
-          <w:szCs w:val="28"/>
+        <w:t>نوبت‌ها را در قالب یک نوار زمان</w:t>
+      </w:r>
+      <w:r>
+        <w:rPr>
+          <w:rFonts w:cs="Mj_Casablanca Light"/>
+          <w:b/>
+          <w:bCs/>
+          <w:sz w:val="28"/>
+          <w:szCs w:val="28"/>
+          <w:lang w:bidi="fa-IR"/>
+        </w:rPr>
+        <w:t xml:space="preserve"> (Timeline) </w:t>
+      </w:r>
+      <w:r>
+        <w:rPr>
+          <w:rFonts w:cs="Mj_Casablanca Light"/>
+          <w:b/>
+          <w:bCs/>
+          <w:sz w:val="28"/>
+          <w:szCs w:val="28"/>
+          <w:rtl/>
+        </w:rPr>
+        <w:t>مشاهده کند</w:t>
+      </w:r>
+      <w:r>
+        <w:rPr>
+          <w:rFonts w:cs="Mj_Casablanca Light"/>
+          <w:b/>
+          <w:bCs/>
+          <w:sz w:val="28"/>
+          <w:szCs w:val="28"/>
+          <w:lang w:bidi="fa-IR"/>
+        </w:rPr>
+        <w:t>.</w:t>
+      </w:r>
+    </w:p>
+    <w:p>
+      <w:pPr>
+        <w:rPr>
+          <w:rFonts w:cs="Mj_Casablanca Light"/>
+          <w:b/>
+          <w:bCs/>
+          <w:sz w:val="28"/>
+          <w:szCs w:val="28"/>
+          <w:rtl/>
+          <w:lang w:bidi="fa-IR"/>
+        </w:rPr>
+      </w:pPr>
+      <w:r>
+        <w:rPr>
+          <w:rFonts w:cs="Mj_Casablanca Light"/>
+          <w:b/>
+          <w:bCs/>
+          <w:sz w:val="28"/>
+          <w:szCs w:val="28"/>
+          <w:rtl/>
+          <w:lang w:bidi="fa-IR"/>
+        </w:rPr>
+        <w:br w:type="page"/>
+      </w:r>
+    </w:p>
+    <w:p>
+      <w:pPr>
+        <w:bidi/>
+        <w:rPr>
+          <w:rFonts w:cs="Mj_Casablanca Light"/>
+          <w:color w:val="00B0F0"/>
+          <w:sz w:val="36"/>
+          <w:szCs w:val="36"/>
+          <w:rtl/>
+          <w:lang w:bidi="fa-IR"/>
+        </w:rPr>
+      </w:pPr>
+      <w:r>
+        <w:rPr>
+          <w:rFonts w:cs="Mj_Casablanca Light" w:hint="cs"/>
+          <w:color w:val="00B0F0"/>
+          <w:sz w:val="36"/>
+          <w:szCs w:val="36"/>
+          <w:rtl/>
+          <w:lang w:bidi="fa-IR"/>
+        </w:rPr>
+        <w:lastRenderedPageBreak/>
+        <w:t>2</w:t>
+      </w:r>
+      <w:r>
+        <w:rPr>
+          <w:rFonts w:cs="Mj_Casablanca Light"/>
+          <w:color w:val="00B0F0"/>
+          <w:sz w:val="36"/>
+          <w:szCs w:val="36"/>
           <w:lang w:bidi="fa-IR"/>
         </w:rPr>
         <w:t xml:space="preserve">. </w:t>
+      </w:r>
+      <w:r>
+        <w:rPr>
+          <w:rFonts w:cs="Mj_Casablanca Light"/>
+          <w:color w:val="00B0F0"/>
+          <w:sz w:val="36"/>
+          <w:szCs w:val="36"/>
+          <w:rtl/>
+        </w:rPr>
+        <w:t>نیازمندی‌های مشتری</w:t>
+      </w:r>
+    </w:p>
+    <w:p>
+      <w:pPr>
+        <w:bidi/>
+        <w:rPr>
+          <w:rFonts w:ascii="Arial" w:hAnsi="Arial" w:cs="Arial"/>
+          <w:sz w:val="32"/>
+          <w:szCs w:val="32"/>
+          <w:rtl/>
+          <w:lang w:bidi="fa-IR"/>
+        </w:rPr>
+      </w:pPr>
+      <w:r>
+        <w:rPr>
+          <w:rFonts w:cs="Mj_Casablanca Light" w:hint="cs"/>
+          <w:sz w:val="32"/>
+          <w:szCs w:val="32"/>
+          <w:rtl/>
+          <w:lang w:bidi="fa-IR"/>
+        </w:rPr>
+        <w:t xml:space="preserve">مشتري نياز دارد كه </w:t>
+      </w:r>
+      <w:r>
+        <w:rPr>
+          <w:rFonts w:cs="Mj_Casablanca Light" w:hint="cs"/>
+          <w:sz w:val="32"/>
+          <w:szCs w:val="32"/>
+          <w:rtl/>
+          <w:lang w:bidi="fa-IR"/>
+        </w:rPr>
+        <w:t xml:space="preserve">بتواند </w:t>
+      </w:r>
+      <w:r>
+        <w:rPr>
+          <w:rFonts w:ascii="Arial" w:hAnsi="Arial" w:cs="Arial" w:hint="cs"/>
+          <w:sz w:val="32"/>
+          <w:szCs w:val="32"/>
+          <w:rtl/>
+          <w:lang w:bidi="fa-IR"/>
+        </w:rPr>
+        <w:t>…</w:t>
+      </w:r>
+    </w:p>
+    <w:p>
+      <w:pPr>
+        <w:pStyle w:val="ListParagraph"/>
+        <w:numPr>
+          <w:ilvl w:val="0"/>
+          <w:numId w:val="6"/>
+        </w:numPr>
+        <w:bidi/>
+        <w:rPr>
+          <w:rFonts w:cs="Mj_Casablanca Light"/>
+          <w:sz w:val="28"/>
+          <w:szCs w:val="28"/>
+          <w:lang w:bidi="fa-IR"/>
+        </w:rPr>
+      </w:pPr>
+      <w:r>
+        <w:rPr>
+          <w:rFonts w:cs="Mj_Casablanca Light"/>
+          <w:sz w:val="28"/>
+          <w:szCs w:val="28"/>
+          <w:rtl/>
+        </w:rPr>
+        <w:t>در سایت ثبت‌نام کرده و وارد حساب کاربری خود شود</w:t>
+      </w:r>
+      <w:r>
+        <w:rPr>
+          <w:rFonts w:cs="Mj_Casablanca Light"/>
+          <w:sz w:val="28"/>
+          <w:szCs w:val="28"/>
+          <w:lang w:bidi="fa-IR"/>
+        </w:rPr>
+        <w:t xml:space="preserve"> (Login/Register). </w:t>
+      </w:r>
+    </w:p>
+    <w:p>
+      <w:pPr>
+        <w:pStyle w:val="ListParagraph"/>
+        <w:numPr>
+          <w:ilvl w:val="0"/>
+          <w:numId w:val="6"/>
+        </w:numPr>
+        <w:bidi/>
+        <w:rPr>
+          <w:rFonts w:cs="Mj_Casablanca Light"/>
+          <w:sz w:val="28"/>
+          <w:szCs w:val="28"/>
+          <w:lang w:bidi="fa-IR"/>
+        </w:rPr>
+      </w:pPr>
+      <w:r>
+        <w:rPr>
+          <w:rFonts w:cs="Mj_Casablanca Light"/>
+          <w:sz w:val="28"/>
+          <w:szCs w:val="28"/>
+          <w:rtl/>
+        </w:rPr>
+        <w:t xml:space="preserve">کسب‌وکارها را بر اساس دسته‌بندی، خدمات و </w:t>
+      </w:r>
+      <w:r>
+        <w:rPr>
+          <w:rFonts w:cs="Mj_Casablanca Light" w:hint="cs"/>
+          <w:sz w:val="28"/>
+          <w:szCs w:val="28"/>
+          <w:rtl/>
+        </w:rPr>
+        <w:t>آدرس</w:t>
+      </w:r>
+      <w:r>
+        <w:rPr>
+          <w:rFonts w:cs="Mj_Casablanca Light"/>
+          <w:sz w:val="28"/>
+          <w:szCs w:val="28"/>
+          <w:rtl/>
+        </w:rPr>
+        <w:t xml:space="preserve"> فیلتر کند</w:t>
+      </w:r>
+      <w:r>
+        <w:rPr>
+          <w:rFonts w:cs="Mj_Casablanca Light"/>
+          <w:sz w:val="28"/>
+          <w:szCs w:val="28"/>
+          <w:lang w:bidi="fa-IR"/>
+        </w:rPr>
+        <w:t xml:space="preserve">. </w:t>
+      </w:r>
+    </w:p>
+    <w:p>
+      <w:pPr>
+        <w:pStyle w:val="ListParagraph"/>
+        <w:numPr>
+          <w:ilvl w:val="0"/>
+          <w:numId w:val="6"/>
+        </w:numPr>
+        <w:bidi/>
+        <w:rPr>
+          <w:rFonts w:cs="Mj_Casablanca Light"/>
+          <w:sz w:val="28"/>
+          <w:szCs w:val="28"/>
+          <w:lang w:bidi="fa-IR"/>
+        </w:rPr>
+      </w:pPr>
+      <w:r>
+        <w:rPr>
+          <w:rFonts w:cs="Mj_Casablanca Light"/>
+          <w:sz w:val="28"/>
+          <w:szCs w:val="28"/>
+          <w:rtl/>
+        </w:rPr>
+        <w:t>نام کسب‌وکار مدنظرش را در دسته‌بندی‌های مختلف جستجو کند</w:t>
+      </w:r>
+      <w:r>
+        <w:rPr>
+          <w:rFonts w:cs="Mj_Casablanca Light"/>
+          <w:sz w:val="28"/>
+          <w:szCs w:val="28"/>
+          <w:lang w:bidi="fa-IR"/>
+        </w:rPr>
+        <w:t xml:space="preserve">. </w:t>
+      </w:r>
+    </w:p>
+    <w:p>
+      <w:pPr>
+        <w:pStyle w:val="ListParagraph"/>
+        <w:numPr>
+          <w:ilvl w:val="0"/>
+          <w:numId w:val="6"/>
+        </w:numPr>
+        <w:bidi/>
+        <w:rPr>
+          <w:rFonts w:cs="Mj_Casablanca Light"/>
+          <w:sz w:val="28"/>
+          <w:szCs w:val="28"/>
+          <w:lang w:bidi="fa-IR"/>
+        </w:rPr>
+      </w:pPr>
+      <w:r>
+        <w:rPr>
+          <w:rFonts w:cs="Mj_Casablanca Light"/>
+          <w:sz w:val="28"/>
+          <w:szCs w:val="28"/>
+          <w:rtl/>
+        </w:rPr>
+        <w:t>پروفایل اختصاصی کسب‌وکار شامل سوابق، اطلاعات تماس و موقعیت مکانی را مشاهده و مطالعه کند</w:t>
+      </w:r>
+      <w:r>
+        <w:rPr>
+          <w:rFonts w:cs="Mj_Casablanca Light"/>
+          <w:sz w:val="28"/>
+          <w:szCs w:val="28"/>
+          <w:lang w:bidi="fa-IR"/>
+        </w:rPr>
+        <w:t xml:space="preserve">. </w:t>
+      </w:r>
+    </w:p>
+    <w:p>
+      <w:pPr>
+        <w:pStyle w:val="ListParagraph"/>
+        <w:numPr>
+          <w:ilvl w:val="0"/>
+          <w:numId w:val="6"/>
+        </w:numPr>
+        <w:bidi/>
+        <w:rPr>
+          <w:rFonts w:cs="Mj_Casablanca Light"/>
+          <w:sz w:val="28"/>
+          <w:szCs w:val="28"/>
+          <w:lang w:bidi="fa-IR"/>
+        </w:rPr>
+      </w:pPr>
+      <w:r>
+        <w:rPr>
+          <w:rFonts w:cs="Mj_Casablanca Light" w:hint="cs"/>
+          <w:sz w:val="28"/>
+          <w:szCs w:val="28"/>
+          <w:rtl/>
+        </w:rPr>
+        <w:t>امتيازات</w:t>
+      </w:r>
+      <w:r>
+        <w:rPr>
+          <w:rFonts w:cs="Mj_Casablanca Light"/>
+          <w:sz w:val="28"/>
+          <w:szCs w:val="28"/>
+          <w:rtl/>
+        </w:rPr>
+        <w:t xml:space="preserve"> سایر کاربران درباره کسب‌وکارها را </w:t>
+      </w:r>
+      <w:r>
+        <w:rPr>
+          <w:rFonts w:cs="Mj_Casablanca Light" w:hint="cs"/>
+          <w:sz w:val="28"/>
+          <w:szCs w:val="28"/>
+          <w:rtl/>
+        </w:rPr>
+        <w:t>مشاهده</w:t>
+      </w:r>
+      <w:r>
+        <w:rPr>
+          <w:rFonts w:cs="Mj_Casablanca Light"/>
+          <w:sz w:val="28"/>
+          <w:szCs w:val="28"/>
+          <w:rtl/>
+        </w:rPr>
+        <w:t xml:space="preserve"> و </w:t>
+      </w:r>
+      <w:r>
+        <w:rPr>
+          <w:rFonts w:cs="Mj_Casablanca Light" w:hint="cs"/>
+          <w:sz w:val="28"/>
+          <w:szCs w:val="28"/>
+          <w:rtl/>
+        </w:rPr>
+        <w:t>امتياز</w:t>
+      </w:r>
+      <w:r>
+        <w:rPr>
+          <w:rFonts w:cs="Mj_Casablanca Light"/>
+          <w:sz w:val="28"/>
+          <w:szCs w:val="28"/>
+          <w:rtl/>
+        </w:rPr>
+        <w:t xml:space="preserve"> خود را ثبت کند</w:t>
+      </w:r>
+      <w:r>
+        <w:rPr>
+          <w:rFonts w:cs="Mj_Casablanca Light"/>
+          <w:sz w:val="28"/>
+          <w:szCs w:val="28"/>
+          <w:lang w:bidi="fa-IR"/>
+        </w:rPr>
+        <w:t xml:space="preserve">. </w:t>
+      </w:r>
+    </w:p>
+    <w:p>
+      <w:pPr>
+        <w:pStyle w:val="ListParagraph"/>
+        <w:numPr>
+          <w:ilvl w:val="0"/>
+          <w:numId w:val="6"/>
+        </w:numPr>
+        <w:bidi/>
+        <w:rPr>
+          <w:rFonts w:cs="Mj_Casablanca Light"/>
+          <w:sz w:val="28"/>
+          <w:szCs w:val="28"/>
+          <w:lang w:bidi="fa-IR"/>
+        </w:rPr>
+      </w:pPr>
+      <w:r>
+        <w:rPr>
+          <w:rFonts w:cs="Mj_Casablanca Light"/>
+          <w:sz w:val="28"/>
+          <w:szCs w:val="28"/>
+          <w:rtl/>
+        </w:rPr>
+        <w:t>تقویم کاری و نوبت‌های خالی کسب‌وکار را ببیند و نوبت خود را رزرو کند</w:t>
+      </w:r>
+      <w:r>
+        <w:rPr>
+          <w:rFonts w:cs="Mj_Casablanca Light"/>
+          <w:sz w:val="28"/>
+          <w:szCs w:val="28"/>
+          <w:lang w:bidi="fa-IR"/>
+        </w:rPr>
+        <w:t xml:space="preserve">. </w:t>
+      </w:r>
+    </w:p>
+    <w:p>
+      <w:pPr>
+        <w:pStyle w:val="ListParagraph"/>
+        <w:numPr>
+          <w:ilvl w:val="0"/>
+          <w:numId w:val="6"/>
+        </w:numPr>
+        <w:bidi/>
+        <w:rPr>
+          <w:rFonts w:cs="Mj_Casablanca Light"/>
+          <w:sz w:val="28"/>
+          <w:szCs w:val="28"/>
+          <w:lang w:bidi="fa-IR"/>
+        </w:rPr>
+      </w:pPr>
+      <w:r>
+        <w:rPr>
+          <w:rFonts w:cs="Mj_Casablanca Light"/>
+          <w:sz w:val="28"/>
+          <w:szCs w:val="28"/>
+          <w:rtl/>
+        </w:rPr>
+        <w:t>لیست تمامی نوبت‌های رزرو شده و سوابق نوبت‌های قبلی خود را مدیریت کند</w:t>
+      </w:r>
+      <w:r>
+        <w:rPr>
+          <w:rFonts w:cs="Mj_Casablanca Light"/>
+          <w:sz w:val="28"/>
+          <w:szCs w:val="28"/>
+          <w:lang w:bidi="fa-IR"/>
+        </w:rPr>
+        <w:t xml:space="preserve">. </w:t>
+      </w:r>
+    </w:p>
+    <w:p>
+      <w:pPr>
+        <w:pStyle w:val="ListParagraph"/>
+        <w:numPr>
+          <w:ilvl w:val="0"/>
+          <w:numId w:val="6"/>
+        </w:numPr>
+        <w:bidi/>
+        <w:rPr>
+          <w:rFonts w:cs="Mj_Casablanca Light"/>
+          <w:sz w:val="28"/>
+          <w:szCs w:val="28"/>
+          <w:lang w:bidi="fa-IR"/>
+        </w:rPr>
+      </w:pPr>
+      <w:r>
+        <w:rPr>
+          <w:rFonts w:cs="Mj_Casablanca Light"/>
+          <w:sz w:val="28"/>
+          <w:szCs w:val="28"/>
+          <w:rtl/>
+        </w:rPr>
+        <w:t xml:space="preserve">بلافاصله پس از رزرو نوبت، </w:t>
+      </w:r>
+      <w:r>
+        <w:rPr>
+          <w:rFonts w:cs="Mj_Casablanca Light" w:hint="cs"/>
+          <w:sz w:val="28"/>
+          <w:szCs w:val="28"/>
+          <w:rtl/>
+        </w:rPr>
+        <w:t>اعلان</w:t>
+      </w:r>
+      <w:r>
+        <w:rPr>
+          <w:rFonts w:cs="Mj_Casablanca Light"/>
+          <w:sz w:val="28"/>
+          <w:szCs w:val="28"/>
+          <w:rtl/>
+        </w:rPr>
+        <w:t xml:space="preserve"> تاییدیه دریافت کند</w:t>
+      </w:r>
+      <w:r>
+        <w:rPr>
+          <w:rFonts w:cs="Mj_Casablanca Light"/>
+          <w:sz w:val="28"/>
+          <w:szCs w:val="28"/>
+          <w:lang w:bidi="fa-IR"/>
+        </w:rPr>
+        <w:t xml:space="preserve">. </w:t>
+      </w:r>
+    </w:p>
+    <w:p>
+      <w:pPr>
+        <w:pStyle w:val="ListParagraph"/>
+        <w:numPr>
+          <w:ilvl w:val="0"/>
+          <w:numId w:val="6"/>
+        </w:numPr>
+        <w:bidi/>
+        <w:rPr>
+          <w:rFonts w:cs="Mj_Casablanca Light"/>
+          <w:sz w:val="28"/>
+          <w:szCs w:val="28"/>
+          <w:lang w:bidi="fa-IR"/>
+        </w:rPr>
+      </w:pPr>
+      <w:r>
+        <w:rPr>
+          <w:rFonts w:cs="Mj_Casablanca Light"/>
+          <w:sz w:val="28"/>
+          <w:szCs w:val="28"/>
+          <w:rtl/>
+        </w:rPr>
+        <w:t>کسب‌وکارها را بر اساس امتیاز (ستاره‌ها) یا نزدیکی به موقعیت مکانی خودش مرتب‌سازی</w:t>
+      </w:r>
+      <w:r>
+        <w:rPr>
+          <w:rFonts w:cs="Mj_Casablanca Light"/>
+          <w:sz w:val="28"/>
+          <w:szCs w:val="28"/>
+          <w:lang w:bidi="fa-IR"/>
+        </w:rPr>
+        <w:t xml:space="preserve"> (Sort) </w:t>
+      </w:r>
+      <w:r>
+        <w:rPr>
+          <w:rFonts w:cs="Mj_Casablanca Light"/>
+          <w:sz w:val="28"/>
+          <w:szCs w:val="28"/>
+          <w:rtl/>
+        </w:rPr>
+        <w:t>کند</w:t>
+      </w:r>
+      <w:r>
+        <w:rPr>
+          <w:rFonts w:cs="Mj_Casablanca Light"/>
+          <w:sz w:val="28"/>
+          <w:szCs w:val="28"/>
+          <w:lang w:bidi="fa-IR"/>
+        </w:rPr>
+        <w:t xml:space="preserve">. </w:t>
+      </w:r>
+    </w:p>
+    <w:p>
+      <w:pPr>
+        <w:pStyle w:val="ListParagraph"/>
+        <w:numPr>
+          <w:ilvl w:val="0"/>
+          <w:numId w:val="6"/>
+        </w:numPr>
+        <w:bidi/>
+        <w:rPr>
+          <w:rFonts w:cs="Mj_Casablanca Light"/>
+          <w:sz w:val="28"/>
+          <w:szCs w:val="28"/>
+          <w:lang w:bidi="fa-IR"/>
+        </w:rPr>
+      </w:pPr>
+      <w:r>
+        <w:rPr>
+          <w:rFonts w:cs="Mj_Casablanca Light"/>
+          <w:sz w:val="28"/>
+          <w:szCs w:val="28"/>
+          <w:rtl/>
+        </w:rPr>
+        <w:t>در صورت نیاز، تاریخ و ساعت نوبت رزرو شده خود را تغییر دهد</w:t>
+      </w:r>
+      <w:r>
+        <w:rPr>
+          <w:rFonts w:cs="Mj_Casablanca Light"/>
+          <w:sz w:val="28"/>
+          <w:szCs w:val="28"/>
+          <w:lang w:bidi="fa-IR"/>
+        </w:rPr>
+        <w:t xml:space="preserve"> (Reschedule) </w:t>
+      </w:r>
+      <w:r>
+        <w:rPr>
+          <w:rFonts w:cs="Mj_Casablanca Light"/>
+          <w:sz w:val="28"/>
+          <w:szCs w:val="28"/>
+          <w:rtl/>
+        </w:rPr>
+        <w:t>یا آن را لغو</w:t>
+      </w:r>
+      <w:r>
+        <w:rPr>
+          <w:rFonts w:cs="Mj_Casablanca Light"/>
+          <w:sz w:val="28"/>
+          <w:szCs w:val="28"/>
+          <w:lang w:bidi="fa-IR"/>
+        </w:rPr>
+        <w:t xml:space="preserve"> (Cancel) </w:t>
+      </w:r>
+      <w:r>
+        <w:rPr>
+          <w:rFonts w:cs="Mj_Casablanca Light"/>
+          <w:sz w:val="28"/>
+          <w:szCs w:val="28"/>
+          <w:rtl/>
+        </w:rPr>
+        <w:t>کند</w:t>
+      </w:r>
+      <w:r>
+        <w:rPr>
+          <w:rFonts w:cs="Mj_Casablanca Light"/>
+          <w:sz w:val="28"/>
+          <w:szCs w:val="28"/>
+          <w:lang w:bidi="fa-IR"/>
+        </w:rPr>
+        <w:t xml:space="preserve">. </w:t>
+      </w:r>
+    </w:p>
+    <w:p>
+      <w:pPr>
+        <w:pStyle w:val="ListParagraph"/>
+        <w:numPr>
+          <w:ilvl w:val="0"/>
+          <w:numId w:val="6"/>
+        </w:numPr>
+        <w:bidi/>
+        <w:rPr>
+          <w:rFonts w:cs="Mj_Casablanca Light"/>
+          <w:sz w:val="28"/>
+          <w:szCs w:val="28"/>
+          <w:lang w:bidi="fa-IR"/>
+        </w:rPr>
+      </w:pPr>
+      <w:r>
+        <w:rPr>
+          <w:rFonts w:cs="Mj_Casablanca Light" w:hint="cs"/>
+          <w:sz w:val="28"/>
+          <w:szCs w:val="28"/>
+          <w:rtl/>
+          <w:lang w:bidi="fa-IR"/>
+        </w:rPr>
+        <w:t xml:space="preserve">امكان ديدن كسب و كار ها و نوبت ها بدون لاگين </w:t>
+      </w:r>
+    </w:p>
+    <w:p>
+      <w:pPr>
+        <w:pStyle w:val="ListParagraph"/>
+        <w:numPr>
+          <w:ilvl w:val="0"/>
+          <w:numId w:val="6"/>
+        </w:numPr>
+        <w:bidi/>
+        <w:rPr>
+          <w:rFonts w:cs="Mj_Casablanca Light"/>
+          <w:sz w:val="28"/>
+          <w:szCs w:val="28"/>
+          <w:rtl/>
+          <w:lang w:bidi="fa-IR"/>
+        </w:rPr>
+      </w:pPr>
+      <w:r>
+        <w:rPr>
+          <w:rFonts w:cs="Mj_Casablanca Light"/>
+          <w:sz w:val="28"/>
+          <w:szCs w:val="28"/>
+          <w:rtl/>
+        </w:rPr>
+        <w:t>از حریم خصوصی خود مطمئن باشد (عدم نمایش تمامی اطلاعات شخصی مشتری به کسب‌وکارها)</w:t>
+      </w:r>
+      <w:r>
+        <w:rPr>
+          <w:rFonts w:cs="Mj_Casablanca Light"/>
+          <w:sz w:val="28"/>
+          <w:szCs w:val="28"/>
+          <w:lang w:bidi="fa-IR"/>
+        </w:rPr>
+        <w:t xml:space="preserve">. </w:t>
+      </w:r>
+      <w:r>
+        <w:rPr>
+          <w:rFonts w:cs="Mj_Casablanca Light"/>
+          <w:color w:val="2E74B5" w:themeColor="accent5" w:themeShade="BF"/>
+          <w:sz w:val="32"/>
+          <w:szCs w:val="32"/>
+          <w:rtl/>
+          <w:lang w:bidi="fa-IR"/>
+        </w:rPr>
+        <w:br w:type="page"/>
+      </w:r>
+    </w:p>
+    <w:p>
+      <w:pPr>
+        <w:bidi/>
+        <w:rPr>
+          <w:rFonts w:cs="Mj_Casablanca Light"/>
+          <w:color w:val="00B0F0"/>
+          <w:sz w:val="36"/>
+          <w:szCs w:val="36"/>
+        </w:rPr>
+      </w:pPr>
+      <w:r>
+        <w:rPr>
+          <w:rFonts w:cs="Mj_Casablanca Light" w:hint="cs"/>
+          <w:b/>
+          <w:bCs/>
+          <w:color w:val="00B0F0"/>
+          <w:sz w:val="36"/>
+          <w:szCs w:val="36"/>
+          <w:rtl/>
+          <w:lang w:bidi="fa-IR"/>
+        </w:rPr>
+        <w:lastRenderedPageBreak/>
+        <w:t>۳. نیازمندی‌های کارمندان حضوری</w:t>
+      </w:r>
+    </w:p>
+    <w:p>
+      <w:pPr>
+        <w:bidi/>
+        <w:rPr>
+          <w:rFonts w:cs="Mj_Casablanca Light"/>
+          <w:sz w:val="32"/>
+          <w:szCs w:val="32"/>
+          <w:lang w:bidi="fa-IR"/>
+        </w:rPr>
+      </w:pPr>
+      <w:r>
+        <w:rPr>
+          <w:rFonts w:cs="Mj_Casablanca Light" w:hint="cs"/>
+          <w:sz w:val="32"/>
+          <w:szCs w:val="32"/>
+          <w:rtl/>
+          <w:lang w:bidi="fa-IR"/>
+        </w:rPr>
+        <w:t xml:space="preserve">کارمندان حضوری نیاز دارند که بتوانند </w:t>
+      </w:r>
+      <w:r>
+        <w:rPr>
+          <w:rFonts w:ascii="Arial" w:hAnsi="Arial" w:cs="Arial" w:hint="cs"/>
+          <w:sz w:val="32"/>
+          <w:szCs w:val="32"/>
+          <w:rtl/>
+          <w:lang w:bidi="fa-IR"/>
+        </w:rPr>
+        <w:t>…</w:t>
       </w:r>
     </w:p>
     <w:p>
@@ -527,712 +1276,29 @@
           <w:bCs/>
           <w:sz w:val="28"/>
           <w:szCs w:val="28"/>
-          <w:lang w:bidi="fa-IR"/>
-        </w:rPr>
-      </w:pPr>
-      <w:r>
-        <w:rPr>
-          <w:rFonts w:cs="Mj_Casablanca Light"/>
-          <w:b/>
-          <w:bCs/>
-          <w:sz w:val="28"/>
-          <w:szCs w:val="28"/>
-          <w:rtl/>
-        </w:rPr>
-        <w:t>نوبت‌ها را در قالب یک نوار زمان</w:t>
-      </w:r>
-      <w:r>
-        <w:rPr>
-          <w:rFonts w:cs="Mj_Casablanca Light"/>
-          <w:b/>
-          <w:bCs/>
-          <w:sz w:val="28"/>
-          <w:szCs w:val="28"/>
-          <w:lang w:bidi="fa-IR"/>
-        </w:rPr>
-        <w:t xml:space="preserve"> (Timeline) </w:t>
-      </w:r>
-      <w:r>
-        <w:rPr>
-          <w:rFonts w:cs="Mj_Casablanca Light"/>
-          <w:b/>
-          <w:bCs/>
-          <w:sz w:val="28"/>
-          <w:szCs w:val="28"/>
-          <w:rtl/>
-        </w:rPr>
-        <w:t>مشاهده کند</w:t>
-      </w:r>
-      <w:r>
-        <w:rPr>
-          <w:rFonts w:cs="Mj_Casablanca Light"/>
-          <w:b/>
-          <w:bCs/>
-          <w:sz w:val="28"/>
-          <w:szCs w:val="28"/>
-          <w:lang w:bidi="fa-IR"/>
-        </w:rPr>
-        <w:t>.</w:t>
-      </w:r>
-    </w:p>
-    <w:p>
-      <w:pPr>
-        <w:rPr>
-          <w:rFonts w:cs="Mj_Casablanca Light"/>
-          <w:b/>
-          <w:bCs/>
-          <w:sz w:val="28"/>
-          <w:szCs w:val="28"/>
-          <w:rtl/>
-          <w:lang w:bidi="fa-IR"/>
-        </w:rPr>
-      </w:pPr>
-      <w:r>
-        <w:rPr>
-          <w:rFonts w:cs="Mj_Casablanca Light"/>
-          <w:b/>
-          <w:bCs/>
-          <w:sz w:val="28"/>
-          <w:szCs w:val="28"/>
-          <w:rtl/>
-          <w:lang w:bidi="fa-IR"/>
-        </w:rPr>
-        <w:br w:type="page"/>
-      </w:r>
-    </w:p>
-    <w:p>
-      <w:pPr>
-        <w:bidi/>
-        <w:rPr>
-          <w:rFonts w:cs="Mj_Casablanca Light"/>
-          <w:color w:val="00B0F0"/>
-          <w:sz w:val="36"/>
-          <w:szCs w:val="36"/>
-          <w:rtl/>
-          <w:lang w:bidi="fa-IR"/>
         </w:rPr>
       </w:pPr>
       <w:r>
         <w:rPr>
           <w:rFonts w:cs="Mj_Casablanca Light" w:hint="cs"/>
-          <w:color w:val="00B0F0"/>
-          <w:sz w:val="36"/>
-          <w:szCs w:val="36"/>
-          <w:rtl/>
-          <w:lang w:bidi="fa-IR"/>
-        </w:rPr>
-        <w:lastRenderedPageBreak/>
-        <w:t>2</w:t>
-      </w:r>
-      <w:r>
-        <w:rPr>
-          <w:rFonts w:cs="Mj_Casablanca Light"/>
-          <w:color w:val="00B0F0"/>
-          <w:sz w:val="36"/>
-          <w:szCs w:val="36"/>
-          <w:lang w:bidi="fa-IR"/>
-        </w:rPr>
-        <w:t xml:space="preserve">. </w:t>
-      </w:r>
-      <w:r>
-        <w:rPr>
-          <w:rFonts w:cs="Mj_Casablanca Light"/>
-          <w:color w:val="00B0F0"/>
-          <w:sz w:val="36"/>
-          <w:szCs w:val="36"/>
-          <w:rtl/>
-        </w:rPr>
-        <w:t>نیازمندی‌های مشتری</w:t>
-      </w:r>
-    </w:p>
-    <w:p>
-      <w:pPr>
-        <w:bidi/>
-        <w:rPr>
-          <w:rFonts w:ascii="Arial" w:hAnsi="Arial" w:cs="Arial"/>
-          <w:sz w:val="32"/>
-          <w:szCs w:val="32"/>
-          <w:rtl/>
-          <w:lang w:bidi="fa-IR"/>
-        </w:rPr>
-      </w:pPr>
+          <w:b/>
+          <w:bCs/>
+          <w:sz w:val="28"/>
+          <w:szCs w:val="28"/>
+          <w:rtl/>
+        </w:rPr>
+        <w:t>وارد پنل کاربری خود شده و تقویم و لیست نوبت‌های همان روز را مشاهده کنند</w:t>
+      </w:r>
       <w:r>
         <w:rPr>
           <w:rFonts w:cs="Mj_Casablanca Light" w:hint="cs"/>
-          <w:sz w:val="32"/>
-          <w:szCs w:val="32"/>
-          <w:rtl/>
-          <w:lang w:bidi="fa-IR"/>
-        </w:rPr>
-        <w:t xml:space="preserve">مشتري نياز دارد كه </w:t>
-      </w:r>
-      <w:r>
-        <w:rPr>
-          <w:rFonts w:cs="Mj_Casablanca Light" w:hint="cs"/>
-          <w:sz w:val="32"/>
-          <w:szCs w:val="32"/>
-          <w:rtl/>
-          <w:lang w:bidi="fa-IR"/>
-        </w:rPr>
-        <w:t xml:space="preserve">بتواند </w:t>
-      </w:r>
-      <w:r>
-        <w:rPr>
-          <w:rFonts w:ascii="Arial" w:hAnsi="Arial" w:cs="Arial" w:hint="cs"/>
-          <w:sz w:val="32"/>
-          <w:szCs w:val="32"/>
-          <w:rtl/>
-          <w:lang w:bidi="fa-IR"/>
-        </w:rPr>
-        <w:t>…</w:t>
-      </w:r>
-    </w:p>
-    <w:p>
-      <w:pPr>
-        <w:pStyle w:val="ListParagraph"/>
-        <w:numPr>
-          <w:ilvl w:val="0"/>
-          <w:numId w:val="6"/>
-        </w:numPr>
-        <w:bidi/>
-        <w:rPr>
-          <w:rFonts w:cs="Mj_Casablanca Light"/>
-          <w:sz w:val="28"/>
-          <w:szCs w:val="28"/>
-          <w:lang w:bidi="fa-IR"/>
-        </w:rPr>
-      </w:pPr>
-      <w:r>
-        <w:rPr>
-          <w:rFonts w:cs="Mj_Casablanca Light"/>
-          <w:sz w:val="28"/>
-          <w:szCs w:val="28"/>
-          <w:rtl/>
-        </w:rPr>
-        <w:t>در سایت ثبت‌نام کرده و وارد حساب کاربری خود شود</w:t>
-      </w:r>
-      <w:r>
-        <w:rPr>
-          <w:rFonts w:cs="Mj_Casablanca Light"/>
-          <w:sz w:val="28"/>
-          <w:szCs w:val="28"/>
-          <w:lang w:bidi="fa-IR"/>
-        </w:rPr>
-        <w:t xml:space="preserve"> (Login/Register). </w:t>
-      </w:r>
-    </w:p>
-    <w:p>
-      <w:pPr>
-        <w:pStyle w:val="ListParagraph"/>
-        <w:numPr>
-          <w:ilvl w:val="0"/>
-          <w:numId w:val="6"/>
-        </w:numPr>
-        <w:bidi/>
-        <w:rPr>
-          <w:rFonts w:cs="Mj_Casablanca Light"/>
-          <w:sz w:val="28"/>
-          <w:szCs w:val="28"/>
-          <w:lang w:bidi="fa-IR"/>
-        </w:rPr>
-      </w:pPr>
-      <w:r>
-        <w:rPr>
-          <w:rFonts w:cs="Mj_Casablanca Light"/>
-          <w:sz w:val="28"/>
-          <w:szCs w:val="28"/>
-          <w:rtl/>
-        </w:rPr>
-        <w:t>کسب‌وکارها را بر اساس دسته‌بندی، خدمات و موقعیت فیلتر کند</w:t>
-      </w:r>
-      <w:r>
-        <w:rPr>
-          <w:rFonts w:cs="Mj_Casablanca Light"/>
-          <w:sz w:val="28"/>
-          <w:szCs w:val="28"/>
-          <w:lang w:bidi="fa-IR"/>
-        </w:rPr>
-        <w:t xml:space="preserve">. </w:t>
-      </w:r>
-    </w:p>
-    <w:p>
-      <w:pPr>
-        <w:pStyle w:val="ListParagraph"/>
-        <w:numPr>
-          <w:ilvl w:val="0"/>
-          <w:numId w:val="6"/>
-        </w:numPr>
-        <w:bidi/>
-        <w:rPr>
-          <w:rFonts w:cs="Mj_Casablanca Light"/>
-          <w:sz w:val="28"/>
-          <w:szCs w:val="28"/>
-          <w:lang w:bidi="fa-IR"/>
-        </w:rPr>
-      </w:pPr>
-      <w:r>
-        <w:rPr>
-          <w:rFonts w:cs="Mj_Casablanca Light"/>
-          <w:sz w:val="28"/>
-          <w:szCs w:val="28"/>
-          <w:rtl/>
-        </w:rPr>
-        <w:t>نام کسب‌وکار مدنظرش را در دسته‌بندی‌های مختلف جستجو کند</w:t>
-      </w:r>
-      <w:r>
-        <w:rPr>
-          <w:rFonts w:cs="Mj_Casablanca Light"/>
-          <w:sz w:val="28"/>
-          <w:szCs w:val="28"/>
-          <w:lang w:bidi="fa-IR"/>
-        </w:rPr>
-        <w:t xml:space="preserve">. </w:t>
-      </w:r>
-    </w:p>
-    <w:p>
-      <w:pPr>
-        <w:pStyle w:val="ListParagraph"/>
-        <w:numPr>
-          <w:ilvl w:val="0"/>
-          <w:numId w:val="6"/>
-        </w:numPr>
-        <w:bidi/>
-        <w:rPr>
-          <w:rFonts w:cs="Mj_Casablanca Light"/>
-          <w:sz w:val="28"/>
-          <w:szCs w:val="28"/>
-          <w:lang w:bidi="fa-IR"/>
-        </w:rPr>
-      </w:pPr>
-      <w:r>
-        <w:rPr>
-          <w:rFonts w:cs="Mj_Casablanca Light"/>
-          <w:sz w:val="28"/>
-          <w:szCs w:val="28"/>
-          <w:rtl/>
-        </w:rPr>
-        <w:t>پروفایل اختصاصی کسب‌وکار شامل سوابق، اطلاعات تماس و موقعیت مکانی را مشاهده و مطالعه کند</w:t>
-      </w:r>
-      <w:r>
-        <w:rPr>
-          <w:rFonts w:cs="Mj_Casablanca Light"/>
-          <w:sz w:val="28"/>
-          <w:szCs w:val="28"/>
-          <w:lang w:bidi="fa-IR"/>
-        </w:rPr>
-        <w:t xml:space="preserve">. </w:t>
-      </w:r>
-    </w:p>
-    <w:p>
-      <w:pPr>
-        <w:pStyle w:val="ListParagraph"/>
-        <w:numPr>
-          <w:ilvl w:val="0"/>
-          <w:numId w:val="6"/>
-        </w:numPr>
-        <w:bidi/>
-        <w:rPr>
-          <w:rFonts w:cs="Mj_Casablanca Light"/>
-          <w:sz w:val="28"/>
-          <w:szCs w:val="28"/>
-          <w:lang w:bidi="fa-IR"/>
-        </w:rPr>
-      </w:pPr>
-      <w:r>
-        <w:rPr>
-          <w:rFonts w:cs="Mj_Casablanca Light"/>
-          <w:sz w:val="28"/>
-          <w:szCs w:val="28"/>
-          <w:rtl/>
-        </w:rPr>
-        <w:t>نظرات سایر کاربران درباره کسب‌وکارها را بخواند و نظر خود را ثبت کند</w:t>
-      </w:r>
-      <w:r>
-        <w:rPr>
-          <w:rFonts w:cs="Mj_Casablanca Light"/>
-          <w:sz w:val="28"/>
-          <w:szCs w:val="28"/>
-          <w:lang w:bidi="fa-IR"/>
-        </w:rPr>
-        <w:t xml:space="preserve">. </w:t>
-      </w:r>
-    </w:p>
-    <w:p>
-      <w:pPr>
-        <w:pStyle w:val="ListParagraph"/>
-        <w:numPr>
-          <w:ilvl w:val="0"/>
-          <w:numId w:val="6"/>
-        </w:numPr>
-        <w:bidi/>
-        <w:rPr>
-          <w:rFonts w:cs="Mj_Casablanca Light"/>
-          <w:sz w:val="28"/>
-          <w:szCs w:val="28"/>
-          <w:lang w:bidi="fa-IR"/>
-        </w:rPr>
-      </w:pPr>
-      <w:r>
-        <w:rPr>
-          <w:rFonts w:cs="Mj_Casablanca Light"/>
-          <w:sz w:val="28"/>
-          <w:szCs w:val="28"/>
-          <w:rtl/>
-        </w:rPr>
-        <w:t>تقویم کاری و نوبت‌های خالی کسب‌وکار را ببیند و نوبت خود را رزرو کند</w:t>
-      </w:r>
-      <w:r>
-        <w:rPr>
-          <w:rFonts w:cs="Mj_Casablanca Light"/>
-          <w:sz w:val="28"/>
-          <w:szCs w:val="28"/>
-          <w:lang w:bidi="fa-IR"/>
-        </w:rPr>
-        <w:t xml:space="preserve">. </w:t>
-      </w:r>
-    </w:p>
-    <w:p>
-      <w:pPr>
-        <w:pStyle w:val="ListParagraph"/>
-        <w:numPr>
-          <w:ilvl w:val="0"/>
-          <w:numId w:val="6"/>
-        </w:numPr>
-        <w:bidi/>
-        <w:rPr>
-          <w:rFonts w:cs="Mj_Casablanca Light"/>
-          <w:sz w:val="28"/>
-          <w:szCs w:val="28"/>
-          <w:lang w:bidi="fa-IR"/>
-        </w:rPr>
-      </w:pPr>
-      <w:r>
-        <w:rPr>
-          <w:rFonts w:cs="Mj_Casablanca Light"/>
-          <w:sz w:val="28"/>
-          <w:szCs w:val="28"/>
-          <w:rtl/>
-        </w:rPr>
-        <w:t>لیست تمامی نوبت‌های رزرو شده و سوابق نوبت‌های قبلی خود را مدیریت کند</w:t>
-      </w:r>
-      <w:r>
-        <w:rPr>
-          <w:rFonts w:cs="Mj_Casablanca Light"/>
-          <w:sz w:val="28"/>
-          <w:szCs w:val="28"/>
-          <w:lang w:bidi="fa-IR"/>
-        </w:rPr>
-        <w:t xml:space="preserve">. </w:t>
-      </w:r>
-    </w:p>
-    <w:p>
-      <w:pPr>
-        <w:pStyle w:val="ListParagraph"/>
-        <w:numPr>
-          <w:ilvl w:val="0"/>
-          <w:numId w:val="6"/>
-        </w:numPr>
-        <w:bidi/>
-        <w:rPr>
-          <w:rFonts w:cs="Mj_Casablanca Light"/>
-          <w:sz w:val="28"/>
-          <w:szCs w:val="28"/>
-          <w:lang w:bidi="fa-IR"/>
-        </w:rPr>
-      </w:pPr>
-      <w:r>
-        <w:rPr>
-          <w:rFonts w:cs="Mj_Casablanca Light"/>
-          <w:sz w:val="28"/>
-          <w:szCs w:val="28"/>
-          <w:rtl/>
-        </w:rPr>
-        <w:t>بلافاصله پس از رزرو نوبت، پیامک تاییدیه دریافت کند</w:t>
-      </w:r>
-      <w:r>
-        <w:rPr>
-          <w:rFonts w:cs="Mj_Casablanca Light"/>
-          <w:sz w:val="28"/>
-          <w:szCs w:val="28"/>
-          <w:lang w:bidi="fa-IR"/>
-        </w:rPr>
-        <w:t xml:space="preserve">. </w:t>
-      </w:r>
-    </w:p>
-    <w:p>
-      <w:pPr>
-        <w:pStyle w:val="ListParagraph"/>
-        <w:numPr>
-          <w:ilvl w:val="0"/>
-          <w:numId w:val="6"/>
-        </w:numPr>
-        <w:bidi/>
-        <w:rPr>
-          <w:rFonts w:cs="Mj_Casablanca Light"/>
-          <w:sz w:val="28"/>
-          <w:szCs w:val="28"/>
-          <w:lang w:bidi="fa-IR"/>
-        </w:rPr>
-      </w:pPr>
-      <w:r>
-        <w:rPr>
-          <w:rFonts w:cs="Mj_Casablanca Light"/>
-          <w:sz w:val="28"/>
-          <w:szCs w:val="28"/>
-          <w:rtl/>
-        </w:rPr>
-        <w:t>موقعیت مکانی کسب‌وکارها را روی نقشه</w:t>
-      </w:r>
-      <w:r>
-        <w:rPr>
-          <w:rFonts w:cs="Mj_Casablanca Light"/>
-          <w:sz w:val="28"/>
-          <w:szCs w:val="28"/>
-          <w:lang w:bidi="fa-IR"/>
-        </w:rPr>
-        <w:t xml:space="preserve"> (Map) </w:t>
-      </w:r>
-      <w:r>
-        <w:rPr>
-          <w:rFonts w:cs="Mj_Casablanca Light"/>
-          <w:sz w:val="28"/>
-          <w:szCs w:val="28"/>
-          <w:rtl/>
-        </w:rPr>
-        <w:t>مشاهده کند</w:t>
-      </w:r>
-      <w:r>
-        <w:rPr>
-          <w:rFonts w:cs="Mj_Casablanca Light"/>
-          <w:sz w:val="28"/>
-          <w:szCs w:val="28"/>
-          <w:lang w:bidi="fa-IR"/>
-        </w:rPr>
-        <w:t xml:space="preserve">. </w:t>
-      </w:r>
-    </w:p>
-    <w:p>
-      <w:pPr>
-        <w:pStyle w:val="ListParagraph"/>
-        <w:numPr>
-          <w:ilvl w:val="0"/>
-          <w:numId w:val="6"/>
-        </w:numPr>
-        <w:bidi/>
-        <w:rPr>
-          <w:rFonts w:cs="Mj_Casablanca Light"/>
-          <w:sz w:val="28"/>
-          <w:szCs w:val="28"/>
-          <w:lang w:bidi="fa-IR"/>
-        </w:rPr>
-      </w:pPr>
-      <w:r>
-        <w:rPr>
-          <w:rFonts w:cs="Mj_Casablanca Light"/>
-          <w:sz w:val="28"/>
-          <w:szCs w:val="28"/>
-          <w:rtl/>
-        </w:rPr>
-        <w:t>کسب‌وکارها را بر اساس امتیاز (ستاره‌ها) یا نزدیکی به موقعیت مکانی خودش مرتب‌سازی</w:t>
-      </w:r>
-      <w:r>
-        <w:rPr>
-          <w:rFonts w:cs="Mj_Casablanca Light"/>
-          <w:sz w:val="28"/>
-          <w:szCs w:val="28"/>
-          <w:lang w:bidi="fa-IR"/>
-        </w:rPr>
-        <w:t xml:space="preserve"> (Sort) </w:t>
-      </w:r>
-      <w:r>
-        <w:rPr>
-          <w:rFonts w:cs="Mj_Casablanca Light"/>
-          <w:sz w:val="28"/>
-          <w:szCs w:val="28"/>
-          <w:rtl/>
-        </w:rPr>
-        <w:t>کند</w:t>
-      </w:r>
-      <w:r>
-        <w:rPr>
-          <w:rFonts w:cs="Mj_Casablanca Light"/>
-          <w:sz w:val="28"/>
-          <w:szCs w:val="28"/>
-          <w:lang w:bidi="fa-IR"/>
-        </w:rPr>
-        <w:t xml:space="preserve">. </w:t>
-      </w:r>
-    </w:p>
-    <w:p>
-      <w:pPr>
-        <w:pStyle w:val="ListParagraph"/>
-        <w:numPr>
-          <w:ilvl w:val="0"/>
-          <w:numId w:val="6"/>
-        </w:numPr>
-        <w:bidi/>
-        <w:rPr>
-          <w:rFonts w:cs="Mj_Casablanca Light"/>
-          <w:sz w:val="28"/>
-          <w:szCs w:val="28"/>
-          <w:lang w:bidi="fa-IR"/>
-        </w:rPr>
-      </w:pPr>
-      <w:r>
-        <w:rPr>
-          <w:rFonts w:cs="Mj_Casablanca Light"/>
-          <w:sz w:val="28"/>
-          <w:szCs w:val="28"/>
-          <w:rtl/>
-        </w:rPr>
-        <w:t>در صورت نیاز، تاریخ و ساعت نوبت رزرو شده خود را تغییر دهد</w:t>
-      </w:r>
-      <w:r>
-        <w:rPr>
-          <w:rFonts w:cs="Mj_Casablanca Light"/>
-          <w:sz w:val="28"/>
-          <w:szCs w:val="28"/>
-          <w:lang w:bidi="fa-IR"/>
-        </w:rPr>
-        <w:t xml:space="preserve"> (Reschedule) </w:t>
-      </w:r>
-      <w:r>
-        <w:rPr>
-          <w:rFonts w:cs="Mj_Casablanca Light"/>
-          <w:sz w:val="28"/>
-          <w:szCs w:val="28"/>
-          <w:rtl/>
-        </w:rPr>
-        <w:t>یا آن را لغو</w:t>
-      </w:r>
-      <w:r>
-        <w:rPr>
-          <w:rFonts w:cs="Mj_Casablanca Light"/>
-          <w:sz w:val="28"/>
-          <w:szCs w:val="28"/>
-          <w:lang w:bidi="fa-IR"/>
-        </w:rPr>
-        <w:t xml:space="preserve"> (Cancel) </w:t>
-      </w:r>
-      <w:r>
-        <w:rPr>
-          <w:rFonts w:cs="Mj_Casablanca Light"/>
-          <w:sz w:val="28"/>
-          <w:szCs w:val="28"/>
-          <w:rtl/>
-        </w:rPr>
-        <w:t>کند</w:t>
-      </w:r>
-      <w:r>
-        <w:rPr>
-          <w:rFonts w:cs="Mj_Casablanca Light"/>
-          <w:sz w:val="28"/>
-          <w:szCs w:val="28"/>
-          <w:lang w:bidi="fa-IR"/>
-        </w:rPr>
-        <w:t xml:space="preserve">. </w:t>
-      </w:r>
-    </w:p>
-    <w:p>
-      <w:pPr>
-        <w:pStyle w:val="ListParagraph"/>
-        <w:numPr>
-          <w:ilvl w:val="0"/>
-          <w:numId w:val="6"/>
-        </w:numPr>
-        <w:bidi/>
-        <w:rPr>
-          <w:rFonts w:cs="Mj_Casablanca Light"/>
-          <w:sz w:val="28"/>
-          <w:szCs w:val="28"/>
-          <w:rtl/>
-          <w:lang w:bidi="fa-IR"/>
-        </w:rPr>
-      </w:pPr>
-      <w:r>
-        <w:rPr>
-          <w:rFonts w:cs="Mj_Casablanca Light"/>
-          <w:sz w:val="28"/>
-          <w:szCs w:val="28"/>
-          <w:rtl/>
-        </w:rPr>
-        <w:t>از حریم خصوصی خود مطمئن باشد (عدم نمایش تمامی اطلاعات شخصی مشتری به کسب‌وکارها)</w:t>
-      </w:r>
-      <w:r>
-        <w:rPr>
-          <w:rFonts w:cs="Mj_Casablanca Light"/>
-          <w:sz w:val="28"/>
-          <w:szCs w:val="28"/>
-          <w:lang w:bidi="fa-IR"/>
-        </w:rPr>
-        <w:t xml:space="preserve">. </w:t>
-      </w:r>
-      <w:r>
-        <w:rPr>
-          <w:rFonts w:cs="Mj_Casablanca Light"/>
-          <w:color w:val="2E74B5" w:themeColor="accent5" w:themeShade="BF"/>
-          <w:sz w:val="32"/>
-          <w:szCs w:val="32"/>
-          <w:rtl/>
-          <w:lang w:bidi="fa-IR"/>
-        </w:rPr>
-        <w:br w:type="page"/>
-      </w:r>
-    </w:p>
-    <w:p>
-      <w:pPr>
-        <w:bidi/>
-        <w:rPr>
-          <w:rFonts w:cs="Mj_Casablanca Light"/>
-          <w:color w:val="00B0F0"/>
-          <w:sz w:val="36"/>
-          <w:szCs w:val="36"/>
-        </w:rPr>
-      </w:pPr>
-      <w:r>
-        <w:rPr>
-          <w:rFonts w:cs="Mj_Casablanca Light" w:hint="cs"/>
-          <w:b/>
-          <w:bCs/>
-          <w:color w:val="00B0F0"/>
-          <w:sz w:val="36"/>
-          <w:szCs w:val="36"/>
-          <w:rtl/>
-          <w:lang w:bidi="fa-IR"/>
-        </w:rPr>
-        <w:lastRenderedPageBreak/>
-        <w:t>۳. نیازمندی‌های کارمندان حضوری</w:t>
-      </w:r>
-    </w:p>
-    <w:p>
-      <w:pPr>
-        <w:bidi/>
-        <w:rPr>
-          <w:rFonts w:cs="Mj_Casablanca Light"/>
-          <w:sz w:val="32"/>
-          <w:szCs w:val="32"/>
-          <w:lang w:bidi="fa-IR"/>
-        </w:rPr>
-      </w:pPr>
-      <w:r>
-        <w:rPr>
-          <w:rFonts w:cs="Mj_Casablanca Light" w:hint="cs"/>
-          <w:sz w:val="32"/>
-          <w:szCs w:val="32"/>
-          <w:rtl/>
-          <w:lang w:bidi="fa-IR"/>
-        </w:rPr>
-        <w:t xml:space="preserve">کارمندان حضوری نیاز دارند که بتوانند </w:t>
-      </w:r>
-      <w:r>
-        <w:rPr>
-          <w:rFonts w:ascii="Arial" w:hAnsi="Arial" w:cs="Arial" w:hint="cs"/>
-          <w:sz w:val="32"/>
-          <w:szCs w:val="32"/>
-          <w:rtl/>
-          <w:lang w:bidi="fa-IR"/>
-        </w:rPr>
-        <w:t>…</w:t>
+          <w:b/>
+          <w:bCs/>
+          <w:sz w:val="28"/>
+          <w:szCs w:val="28"/>
+          <w:rtl/>
+        </w:rPr>
+        <w:t xml:space="preserve"> تا بتواند خدمات رو به درستي و با رعايت نوبت داده شده ؛ ارائه كند. </w:t>
       </w:r>
     </w:p>
     <w:p>
@@ -1261,113 +1327,7 @@
           <w:szCs w:val="28"/>
           <w:rtl/>
         </w:rPr>
-        <w:t>وارد پنل کاربری خود شده و تقویم و لیست نوبت‌های همان روز را مشاهده کنند</w:t>
-      </w:r>
-      <w:r>
-        <w:rPr>
-          <w:rFonts w:cs="Mj_Casablanca Light" w:hint="cs"/>
-          <w:b/>
-          <w:bCs/>
-          <w:sz w:val="28"/>
-          <w:szCs w:val="28"/>
-          <w:rtl/>
-        </w:rPr>
-        <w:t xml:space="preserve"> تا بتواند خدمات رو به درستي و با رعايت نوبت داده شده ؛ ارائه كند. </w:t>
-      </w:r>
-      <w:r>
-        <w:rPr>
-          <w:rFonts w:cs="Mj_Casablanca Light"/>
-          <w:b/>
-          <w:bCs/>
-          <w:sz w:val="28"/>
-          <w:szCs w:val="28"/>
-          <w:rtl/>
-          <w:lang w:bidi="fa-IR"/>
-        </w:rPr>
-        <w:br w:type="page"/>
-      </w:r>
-    </w:p>
-    <w:p>
-      <w:pPr>
-        <w:bidi/>
-        <w:rPr>
-          <w:rFonts w:cs="Mj_Casablanca Light"/>
-          <w:b/>
-          <w:bCs/>
-          <w:color w:val="00B0F0"/>
-          <w:sz w:val="36"/>
-          <w:szCs w:val="36"/>
-          <w:rtl/>
-        </w:rPr>
-      </w:pPr>
-      <w:r>
-        <w:rPr>
-          <w:rFonts w:cs="Mj_Casablanca Light"/>
-          <w:b/>
-          <w:bCs/>
-          <w:color w:val="00B0F0"/>
-          <w:sz w:val="36"/>
-          <w:szCs w:val="36"/>
-          <w:rtl/>
-          <w:lang w:bidi="fa-IR"/>
-        </w:rPr>
-        <w:lastRenderedPageBreak/>
-        <w:t>۴</w:t>
-      </w:r>
-      <w:r>
-        <w:rPr>
-          <w:rFonts w:cs="Mj_Casablanca Light"/>
-          <w:b/>
-          <w:bCs/>
-          <w:color w:val="00B0F0"/>
-          <w:sz w:val="36"/>
-          <w:szCs w:val="36"/>
-          <w:lang w:bidi="fa-IR"/>
-        </w:rPr>
-        <w:t xml:space="preserve">. </w:t>
-      </w:r>
-      <w:r>
-        <w:rPr>
-          <w:rFonts w:cs="Mj_Casablanca Light"/>
-          <w:b/>
-          <w:bCs/>
-          <w:color w:val="00B0F0"/>
-          <w:sz w:val="36"/>
-          <w:szCs w:val="36"/>
-          <w:rtl/>
-        </w:rPr>
-        <w:t>نیازمندی‌های کارمندان پشتیبانی بخش آنلاین</w:t>
-      </w:r>
-    </w:p>
-    <w:p>
-      <w:pPr>
-        <w:bidi/>
-        <w:rPr>
-          <w:rFonts w:cs="Mj_Casablanca Light"/>
-          <w:sz w:val="32"/>
-          <w:szCs w:val="32"/>
-          <w:lang w:bidi="fa-IR"/>
-        </w:rPr>
-      </w:pPr>
-      <w:r>
-        <w:rPr>
-          <w:rFonts w:cs="Mj_Casablanca Light" w:hint="cs"/>
-          <w:sz w:val="32"/>
-          <w:szCs w:val="32"/>
-          <w:rtl/>
-          <w:lang w:bidi="fa-IR"/>
-        </w:rPr>
-        <w:t xml:space="preserve">کارمندان پشتیبانی آنلاین نیاز دارند که بتوانند </w:t>
-      </w:r>
-      <w:r>
-        <w:rPr>
-          <w:rFonts w:ascii="Arial" w:hAnsi="Arial" w:cs="Arial" w:hint="cs"/>
-          <w:sz w:val="32"/>
-          <w:szCs w:val="32"/>
-          <w:rtl/>
-          <w:lang w:bidi="fa-IR"/>
-        </w:rPr>
-        <w:t>…</w:t>
+        <w:t>وضعیت نوبت مشتریان را تغییر دهند (مثلاً: حضور یافت، لغو شد، انجام شد).</w:t>
       </w:r>
     </w:p>
     <w:p>
@@ -1384,28 +1344,103 @@
           <w:bCs/>
           <w:sz w:val="28"/>
           <w:szCs w:val="28"/>
-        </w:rPr>
-      </w:pPr>
-      <w:r>
-        <w:rPr>
-          <w:rFonts w:cs="Mj_Casablanca Light"/>
-          <w:b/>
-          <w:bCs/>
-          <w:sz w:val="28"/>
-          <w:szCs w:val="28"/>
-          <w:rtl/>
-        </w:rPr>
-        <w:t>اطلاعیه‌ها، اخبار و تبلیغات جدید کسب‌وکار را در صفحه اختصاصی سایت منتشر کنند</w:t>
-      </w:r>
-      <w:r>
-        <w:rPr>
-          <w:rFonts w:cs="Mj_Casablanca Light"/>
-          <w:b/>
-          <w:bCs/>
-          <w:sz w:val="28"/>
-          <w:szCs w:val="28"/>
+          <w:rtl/>
+        </w:rPr>
+      </w:pPr>
+      <w:r>
+        <w:rPr>
+          <w:rFonts w:cs="Mj_Casablanca Light"/>
+          <w:b/>
+          <w:bCs/>
+          <w:sz w:val="28"/>
+          <w:szCs w:val="28"/>
+          <w:rtl/>
+          <w:lang w:bidi="fa-IR"/>
+        </w:rPr>
+        <w:br w:type="page"/>
+      </w:r>
+    </w:p>
+    <w:p>
+      <w:pPr>
+        <w:bidi/>
+        <w:rPr>
+          <w:rFonts w:cs="Mj_Casablanca Light"/>
+          <w:b/>
+          <w:bCs/>
+          <w:color w:val="00B0F0"/>
+          <w:sz w:val="36"/>
+          <w:szCs w:val="36"/>
+          <w:rtl/>
+        </w:rPr>
+      </w:pPr>
+      <w:r>
+        <w:rPr>
+          <w:rFonts w:cs="Mj_Casablanca Light"/>
+          <w:b/>
+          <w:bCs/>
+          <w:color w:val="00B0F0"/>
+          <w:sz w:val="36"/>
+          <w:szCs w:val="36"/>
+          <w:rtl/>
+          <w:lang w:bidi="fa-IR"/>
+        </w:rPr>
+        <w:lastRenderedPageBreak/>
+        <w:t>۴</w:t>
+      </w:r>
+      <w:r>
+        <w:rPr>
+          <w:rFonts w:cs="Mj_Casablanca Light"/>
+          <w:b/>
+          <w:bCs/>
+          <w:color w:val="00B0F0"/>
+          <w:sz w:val="36"/>
+          <w:szCs w:val="36"/>
+          <w:lang w:bidi="fa-IR"/>
         </w:rPr>
         <w:t xml:space="preserve">. </w:t>
+      </w:r>
+      <w:r>
+        <w:rPr>
+          <w:rFonts w:cs="Mj_Casablanca Light"/>
+          <w:b/>
+          <w:bCs/>
+          <w:color w:val="00B0F0"/>
+          <w:sz w:val="36"/>
+          <w:szCs w:val="36"/>
+          <w:rtl/>
+        </w:rPr>
+        <w:t>نیازمندی‌های کارمندان پشتیبانی بخش آنلاین</w:t>
+      </w:r>
+    </w:p>
+    <w:p>
+      <w:pPr>
+        <w:bidi/>
+        <w:rPr>
+          <w:rFonts w:cs="Mj_Casablanca Light"/>
+          <w:sz w:val="32"/>
+          <w:szCs w:val="32"/>
+          <w:lang w:bidi="fa-IR"/>
+        </w:rPr>
+      </w:pPr>
+      <w:r>
+        <w:rPr>
+          <w:rFonts w:cs="Mj_Casablanca Light" w:hint="cs"/>
+          <w:sz w:val="32"/>
+          <w:szCs w:val="32"/>
+          <w:rtl/>
+          <w:lang w:bidi="fa-IR"/>
+        </w:rPr>
+        <w:t xml:space="preserve">کارمندان پشتیبانی آنلاین نیاز دارند که بتوانند </w:t>
+      </w:r>
+      <w:r>
+        <w:rPr>
+          <w:rFonts w:ascii="Arial" w:hAnsi="Arial" w:cs="Arial" w:hint="cs"/>
+          <w:sz w:val="32"/>
+          <w:szCs w:val="32"/>
+          <w:rtl/>
+          <w:lang w:bidi="fa-IR"/>
+        </w:rPr>
+        <w:t>…</w:t>
       </w:r>
     </w:p>
     <w:p>
@@ -1433,7 +1468,7 @@
           <w:szCs w:val="28"/>
           <w:rtl/>
         </w:rPr>
-        <w:t>اطلاعات پروفایل کسب‌وکار (مثل ساعات کاری یا راه‌های ارتباطی) را در صورت نیاز به‌روزرسانی کنند</w:t>
+        <w:t>اطلاعیه‌ها، اخبار و تبلیغات جدید کسب‌وکار را در صفحه اختصاصی سایت منتشر کنند</w:t>
       </w:r>
       <w:r>
         <w:rPr>
@@ -1471,7 +1506,7 @@
           <w:szCs w:val="28"/>
           <w:rtl/>
         </w:rPr>
-        <w:t>به مشتریانی که در فرآیند اخذ نوبت آنلاین دچار مشکل شده‌اند راهنمایی ارائه دهند</w:t>
+        <w:t>اطلاعات پروفایل کسب‌وکار (مثل ساعات کاری یا راه‌های ارتباطی) را در صورت نیاز به‌روزرسانی کنند</w:t>
       </w:r>
       <w:r>
         <w:rPr>
@@ -1509,17 +1544,17 @@
           <w:szCs w:val="28"/>
           <w:rtl/>
         </w:rPr>
-        <w:t>نظرات ثبت شده کاربران را بررسی اولیه کرده و در صورت نیاز به مدیر ارجاع دهند</w:t>
-      </w:r>
-      <w:r>
-        <w:rPr>
-          <w:rFonts w:cs="Mj_Casablanca Light"/>
-          <w:b/>
-          <w:bCs/>
-          <w:sz w:val="28"/>
-          <w:szCs w:val="28"/>
-        </w:rPr>
-        <w:t>.</w:t>
+        <w:t>به مشتریانی که در فرآیند اخذ نوبت آنلاین دچار مشکل شده‌اند راهنمایی ارائه دهند</w:t>
+      </w:r>
+      <w:r>
+        <w:rPr>
+          <w:rFonts w:cs="Mj_Casablanca Light"/>
+          <w:b/>
+          <w:bCs/>
+          <w:sz w:val="28"/>
+          <w:szCs w:val="28"/>
+        </w:rPr>
+        <w:t xml:space="preserve">. </w:t>
       </w:r>
     </w:p>
     <w:p>
@@ -1549,35 +1584,6 @@
           <w:rtl/>
         </w:rPr>
         <w:t>برای مشتریانی که به صورت حضوری یا تلفنی مراجعه می‌کنند، نوبت جدید در سیستم ثبت کنند.</w:t>
-      </w:r>
-    </w:p>
-    <w:p>
-      <w:pPr>
-        <w:pStyle w:val="ListParagraph"/>
-        <w:numPr>
-          <w:ilvl w:val="0"/>
-          <w:numId w:val="8"/>
-        </w:numPr>
-        <w:bidi/>
-        <w:rPr>
-          <w:rFonts w:cs="Mj_Casablanca Light"/>
-          <w:b/>
-          <w:bCs/>
-          <w:sz w:val="28"/>
-          <w:szCs w:val="28"/>
-          <w:rtl/>
-        </w:rPr>
-      </w:pPr>
-      <w:r>
-        <w:rPr>
-          <w:rFonts w:cs="Mj_Casablanca Light" w:hint="cs"/>
-          <w:b/>
-          <w:bCs/>
-          <w:sz w:val="28"/>
-          <w:szCs w:val="28"/>
-          <w:rtl/>
-        </w:rPr>
-        <w:t>وضعیت نوبت مشتریان را تغییر دهند (مثلاً: حضور یافت، لغو شد، انجام شد).</w:t>
       </w:r>
     </w:p>
     <w:p>
@@ -1959,7 +1965,7 @@
         <v:path o:extrusionok="f" gradientshapeok="t" o:connecttype="rect"/>
         <o:lock v:ext="edit" aspectratio="t"/>
       </v:shapetype>
-      <v:shape id="_x0000_i1025" type="#_x0000_t75" style="width:11.25pt;height:11.25pt" o:bullet="t">
+      <v:shape id="_x0000_i1025" type="#_x0000_t75" style="width:11.4pt;height:11.4pt" o:bullet="t">
         <v:imagedata r:id="rId1" o:title="mso3BF"/>
       </v:shape>
     </w:pict>

</xml_diff>

<commit_message>
Update BusinessRequirements; Update Functional-NonFunctional Requirement; Update UserRequirements
</commit_message>
<xml_diff>
--- a/Documentation/Analysis/Requirements Analysis/BusinessRequirements - W.docx
+++ b/Documentation/Analysis/Requirements Analysis/BusinessRequirements - W.docx
@@ -1409,7 +1409,19 @@
           <w:szCs w:val="36"/>
           <w:rtl/>
         </w:rPr>
-        <w:t>نیازمندی‌های کارمندان پشتیبانی بخش آنلاین</w:t>
+        <w:t xml:space="preserve">نیازمندی‌های </w:t>
+      </w:r>
+      <w:r>
+        <w:rPr>
+          <w:rFonts w:cs="Mj_Casablanca Light" w:hint="cs"/>
+          <w:b/>
+          <w:bCs/>
+          <w:color w:val="00B0F0"/>
+          <w:sz w:val="36"/>
+          <w:szCs w:val="36"/>
+          <w:rtl/>
+        </w:rPr>
+        <w:t>پشتيبان سازمان</w:t>
       </w:r>
     </w:p>
     <w:p>
@@ -1965,7 +1977,7 @@
         <v:path o:extrusionok="f" gradientshapeok="t" o:connecttype="rect"/>
         <o:lock v:ext="edit" aspectratio="t"/>
       </v:shapetype>
-      <v:shape id="_x0000_i1025" type="#_x0000_t75" style="width:11.4pt;height:11.4pt" o:bullet="t">
+      <v:shape id="_x0000_i1025" type="#_x0000_t75" style="width:11.35pt;height:11.35pt" o:bullet="t">
         <v:imagedata r:id="rId1" o:title="mso3BF"/>
       </v:shape>
     </w:pict>

</xml_diff>